<commit_message>
D-> 16, 17 and 18 completed!
</commit_message>
<xml_diff>
--- a/Received/2/2, Nepali.docx
+++ b/Received/2/2, Nepali.docx
@@ -96,7 +96,7 @@
                                 <w:sz w:val="32"/>
                                 <w:szCs w:val="32"/>
                               </w:rPr>
-                              <w:t>2</w:t>
+                              <w:t>6</w:t>
                             </w:r>
                           </w:p>
                         </w:txbxContent>
@@ -154,7 +154,7 @@
                           <w:sz w:val="32"/>
                           <w:szCs w:val="32"/>
                         </w:rPr>
-                        <w:t>2</w:t>
+                        <w:t>6</w:t>
                       </w:r>
                     </w:p>
                   </w:txbxContent>
@@ -237,10 +237,13 @@
           <w:sz w:val="40"/>
           <w:szCs w:val="40"/>
         </w:rPr>
-        <w:t>u|</w:t>
-      </w:r>
-      <w:proofErr w:type="gramStart"/>
-      <w:r>
+        <w:t>u|Lg ;f];fO6L klAns :s'n</w:t>
+      </w:r>
+    </w:p>
+    <w:p>
+      <w:pPr>
+        <w:spacing w:after="0" w:line="240" w:lineRule="auto"/>
+        <w:jc w:val="center"/>
         <w:rPr>
           <w:rFonts w:ascii="Preeti" w:hAnsi="Preeti"/>
           <w:b/>
@@ -248,10 +251,21 @@
           <w:sz w:val="40"/>
           <w:szCs w:val="40"/>
         </w:rPr>
-        <w:t>Lg ;f];fO</w:t>
-      </w:r>
-      <w:proofErr w:type="gramEnd"/>
-      <w:r>
+      </w:pPr>
+      <w:r>
+        <w:rPr>
+          <w:rFonts w:ascii="Preeti" w:hAnsi="Preeti"/>
+          <w:b/>
+          <w:sz w:val="28"/>
+          <w:szCs w:val="28"/>
+        </w:rPr>
+        <w:t>/Tggu/–&amp;, ;f}/fxf lrtjg</w:t>
+      </w:r>
+    </w:p>
+    <w:p>
+      <w:pPr>
+        <w:spacing w:after="0" w:line="240" w:lineRule="auto"/>
+        <w:jc w:val="center"/>
         <w:rPr>
           <w:rFonts w:ascii="Preeti" w:hAnsi="Preeti"/>
           <w:b/>
@@ -259,76 +273,7 @@
           <w:sz w:val="40"/>
           <w:szCs w:val="40"/>
         </w:rPr>
-        <w:t xml:space="preserve">6L </w:t>
-      </w:r>
-      <w:proofErr w:type="gramStart"/>
-      <w:r>
-        <w:rPr>
-          <w:rFonts w:ascii="Preeti" w:hAnsi="Preeti"/>
-          <w:b/>
-          <w:bCs/>
-          <w:sz w:val="40"/>
-          <w:szCs w:val="40"/>
-        </w:rPr>
-        <w:t>klAns :s'n</w:t>
-      </w:r>
-      <w:proofErr w:type="gramEnd"/>
-    </w:p>
-    <w:p>
-      <w:pPr>
-        <w:spacing w:after="0" w:line="240" w:lineRule="auto"/>
-        <w:jc w:val="center"/>
-        <w:rPr>
-          <w:rFonts w:ascii="Preeti" w:hAnsi="Preeti"/>
-          <w:b/>
-          <w:bCs/>
-          <w:sz w:val="40"/>
-          <w:szCs w:val="40"/>
-        </w:rPr>
-      </w:pPr>
-      <w:r>
-        <w:rPr>
-          <w:rFonts w:ascii="Preeti" w:hAnsi="Preeti"/>
-          <w:b/>
-          <w:sz w:val="28"/>
-          <w:szCs w:val="28"/>
-        </w:rPr>
-        <w:t>/Tggu/–&amp;</w:t>
-      </w:r>
-      <w:proofErr w:type="gramStart"/>
-      <w:r>
-        <w:rPr>
-          <w:rFonts w:ascii="Preeti" w:hAnsi="Preeti"/>
-          <w:b/>
-          <w:sz w:val="28"/>
-          <w:szCs w:val="28"/>
-        </w:rPr>
-        <w:t>, ;f</w:t>
-      </w:r>
-      <w:proofErr w:type="gramEnd"/>
-      <w:r>
-        <w:rPr>
-          <w:rFonts w:ascii="Preeti" w:hAnsi="Preeti"/>
-          <w:b/>
-          <w:sz w:val="28"/>
-          <w:szCs w:val="28"/>
-        </w:rPr>
-        <w:t>}/fxf lrtjg</w:t>
-      </w:r>
-    </w:p>
-    <w:p>
-      <w:pPr>
-        <w:spacing w:after="0" w:line="240" w:lineRule="auto"/>
-        <w:jc w:val="center"/>
-        <w:rPr>
-          <w:rFonts w:ascii="Preeti" w:hAnsi="Preeti"/>
-          <w:b/>
-          <w:bCs/>
-          <w:sz w:val="40"/>
-          <w:szCs w:val="40"/>
-        </w:rPr>
-      </w:pPr>
-      <w:proofErr w:type="gramStart"/>
+      </w:pPr>
       <w:r>
         <w:rPr>
           <w:rFonts w:ascii="Preeti" w:hAnsi="Preeti"/>
@@ -337,18 +282,7 @@
           <w:szCs w:val="36"/>
           <w:u w:val="single"/>
         </w:rPr>
-        <w:t>jflif{</w:t>
-      </w:r>
-      <w:proofErr w:type="gramEnd"/>
-      <w:r>
-        <w:rPr>
-          <w:rFonts w:ascii="Preeti" w:hAnsi="Preeti"/>
-          <w:b/>
-          <w:sz w:val="36"/>
-          <w:szCs w:val="36"/>
-          <w:u w:val="single"/>
-        </w:rPr>
-        <w:t>s</w:t>
+        <w:t>jflif{s</w:t>
       </w:r>
       <w:r>
         <w:rPr>
@@ -420,7 +354,6 @@
         </w:rPr>
         <w:t xml:space="preserve">sIff M– </w:t>
       </w:r>
-      <w:proofErr w:type="gramStart"/>
       <w:r>
         <w:rPr>
           <w:rFonts w:ascii="Preeti" w:hAnsi="Preeti"/>
@@ -460,7 +393,6 @@
         </w:rPr>
         <w:tab/>
       </w:r>
-      <w:proofErr w:type="gramEnd"/>
       <w:r>
         <w:rPr>
           <w:rFonts w:ascii="Times New Roman" w:hAnsi="Times New Roman"/>
@@ -525,22 +457,13 @@
       </w:r>
       <w:r>
         <w:rPr>
-          <w:rFonts w:ascii="Preeti" w:hAnsi="Preeti" w:hint="cs"/>
-          <w:b/>
-          <w:cs/>
-          <w:lang w:eastAsia="zh-CN" w:bidi="hi-IN"/>
-        </w:rPr>
-        <w:t xml:space="preserve"> </w:t>
-      </w:r>
-      <w:r>
-        <w:rPr>
           <w:rFonts w:ascii="Preeti" w:hAnsi="Preeti"/>
           <w:b/>
           <w:sz w:val="28"/>
           <w:szCs w:val="28"/>
           <w:lang w:eastAsia="zh-CN" w:bidi="hi-IN"/>
         </w:rPr>
-        <w:t>+</w:t>
+        <w:t xml:space="preserve"> </w:t>
       </w:r>
       <w:r>
         <w:rPr>
@@ -629,27 +552,7 @@
           <w:sz w:val="32"/>
           <w:szCs w:val="32"/>
         </w:rPr>
-        <w:t>k"0</w:t>
-      </w:r>
-      <w:proofErr w:type="gramStart"/>
-      <w:r>
-        <w:rPr>
-          <w:rFonts w:ascii="Preeti" w:hAnsi="Preeti"/>
-          <w:b/>
-          <w:sz w:val="32"/>
-          <w:szCs w:val="32"/>
-        </w:rPr>
-        <w:t>f{</w:t>
-      </w:r>
-      <w:proofErr w:type="gramEnd"/>
-      <w:r>
-        <w:rPr>
-          <w:rFonts w:ascii="Preeti" w:hAnsi="Preeti"/>
-          <w:b/>
-          <w:sz w:val="32"/>
-          <w:szCs w:val="32"/>
-        </w:rPr>
-        <w:t>f</w:t>
+        <w:t>k"0f{f</w:t>
       </w:r>
       <w:r>
         <w:rPr>
@@ -671,7 +574,6 @@
         </w:rPr>
         <w:t xml:space="preserve"> </w:t>
       </w:r>
-      <w:proofErr w:type="gramStart"/>
       <w:r>
         <w:rPr>
           <w:rFonts w:ascii="Preeti" w:hAnsi="Preeti"/>
@@ -690,18 +592,7 @@
           <w:szCs w:val="24"/>
           <w:lang w:eastAsia="zh-CN" w:bidi="hi-IN"/>
         </w:rPr>
-        <w:t xml:space="preserve">   </w:t>
-      </w:r>
-      <w:proofErr w:type="gramEnd"/>
-      <w:r>
-        <w:rPr>
-          <w:rFonts w:ascii="Preeti" w:hAnsi="Preeti"/>
-          <w:bCs/>
-          <w:sz w:val="24"/>
-          <w:szCs w:val="24"/>
-          <w:lang w:eastAsia="zh-CN" w:bidi="hi-IN"/>
-        </w:rPr>
-        <w:t xml:space="preserve">     </w:t>
+        <w:t xml:space="preserve">        </w:t>
       </w:r>
       <w:r>
         <w:rPr>
@@ -723,7 +614,6 @@
         </w:rPr>
         <w:t xml:space="preserve"> </w:t>
       </w:r>
-      <w:proofErr w:type="gramStart"/>
       <w:r>
         <w:rPr>
           <w:rFonts w:ascii="Preeti" w:hAnsi="Preeti" w:cs="Times New Roman"/>
@@ -734,7 +624,6 @@
         </w:rPr>
         <w:t>g]kfnL</w:t>
       </w:r>
-      <w:proofErr w:type="gramEnd"/>
       <w:r>
         <w:rPr>
           <w:rFonts w:ascii="Preeti" w:hAnsi="Preeti"/>
@@ -794,7 +683,6 @@
                 <w:szCs w:val="40"/>
               </w:rPr>
             </w:pPr>
-            <w:proofErr w:type="gramStart"/>
             <w:r>
               <w:rPr>
                 <w:rFonts w:ascii="Preeti" w:hAnsi="Preeti"/>
@@ -813,18 +701,7 @@
                 <w:sz w:val="40"/>
                 <w:szCs w:val="40"/>
               </w:rPr>
-              <w:t>:</w:t>
-            </w:r>
-            <w:proofErr w:type="gramEnd"/>
-            <w:r>
-              <w:rPr>
-                <w:rFonts w:ascii="Times New Roman" w:hAnsi="Times New Roman"/>
-                <w:b/>
-                <w:bCs/>
-                <w:sz w:val="40"/>
-                <w:szCs w:val="40"/>
-              </w:rPr>
-              <w:t xml:space="preserve"> </w:t>
+              <w:t xml:space="preserve">: </w:t>
             </w:r>
             <w:r>
               <w:rPr>
@@ -834,62 +711,7 @@
                 <w:sz w:val="40"/>
                 <w:szCs w:val="40"/>
               </w:rPr>
-              <w:t>====================================================/</w:t>
-            </w:r>
-            <w:proofErr w:type="gramStart"/>
-            <w:r>
-              <w:rPr>
-                <w:rFonts w:ascii="Preeti" w:hAnsi="Preeti"/>
-                <w:b/>
-                <w:bCs/>
-                <w:sz w:val="40"/>
-                <w:szCs w:val="40"/>
-              </w:rPr>
-              <w:t>f]n</w:t>
-            </w:r>
-            <w:proofErr w:type="gramEnd"/>
-            <w:r>
-              <w:rPr>
-                <w:rFonts w:ascii="Preeti" w:hAnsi="Preeti"/>
-                <w:b/>
-                <w:bCs/>
-                <w:sz w:val="40"/>
-                <w:szCs w:val="40"/>
-              </w:rPr>
-              <w:t xml:space="preserve"> g+=============</w:t>
-            </w:r>
-            <w:proofErr w:type="gramStart"/>
-            <w:r>
-              <w:rPr>
-                <w:rFonts w:ascii="Preeti" w:hAnsi="Preeti"/>
-                <w:b/>
-                <w:bCs/>
-                <w:sz w:val="40"/>
-                <w:szCs w:val="40"/>
-              </w:rPr>
-              <w:t>;]S</w:t>
-            </w:r>
-            <w:proofErr w:type="gramEnd"/>
-            <w:r>
-              <w:rPr>
-                <w:rFonts w:ascii="Preeti" w:hAnsi="Preeti"/>
-                <w:b/>
-                <w:bCs/>
-                <w:sz w:val="40"/>
-                <w:szCs w:val="40"/>
-              </w:rPr>
-              <w:t xml:space="preserve">;g </w:t>
-            </w:r>
-            <w:proofErr w:type="gramStart"/>
-            <w:r>
-              <w:rPr>
-                <w:rFonts w:ascii="Preeti" w:hAnsi="Preeti"/>
-                <w:b/>
-                <w:bCs/>
-                <w:sz w:val="40"/>
-                <w:szCs w:val="40"/>
-              </w:rPr>
-              <w:t>M</w:t>
+              <w:t>====================================================/f]n g+=============;]S;g M</w:t>
             </w:r>
             <w:r>
               <w:rPr>
@@ -909,18 +731,7 @@
                 <w:sz w:val="40"/>
                 <w:szCs w:val="40"/>
               </w:rPr>
-              <w:t>=</w:t>
-            </w:r>
-            <w:proofErr w:type="gramEnd"/>
-            <w:r>
-              <w:rPr>
-                <w:rFonts w:ascii="Preeti" w:hAnsi="Preeti"/>
-                <w:b/>
-                <w:bCs/>
-                <w:sz w:val="40"/>
-                <w:szCs w:val="40"/>
-              </w:rPr>
-              <w:t>===============</w:t>
+              <w:t>================</w:t>
             </w:r>
             <w:r>
               <w:rPr>
@@ -1067,18 +878,7 @@
                 <w:sz w:val="36"/>
                 <w:szCs w:val="36"/>
               </w:rPr>
-              <w:t>s'n k|</w:t>
-            </w:r>
-            <w:proofErr w:type="gramStart"/>
-            <w:r>
-              <w:rPr>
-                <w:rFonts w:ascii="Preeti" w:hAnsi="Preeti"/>
-                <w:b/>
-                <w:bCs/>
-                <w:sz w:val="36"/>
-                <w:szCs w:val="36"/>
-              </w:rPr>
-              <w:t>fKtf</w:t>
+              <w:t>s'n k|fKtf</w:t>
             </w:r>
             <w:r>
               <w:rPr>
@@ -1099,7 +899,6 @@
               </w:rPr>
               <w:t>:</w:t>
             </w:r>
-            <w:proofErr w:type="gramEnd"/>
           </w:p>
           <w:p>
             <w:pPr>
@@ -1133,20 +932,8 @@
                 <w:sz w:val="32"/>
                 <w:szCs w:val="32"/>
               </w:rPr>
-              <w:t>lg/LIfssf</w:t>
+              <w:t>lg/LIfssf] ;xL</w:t>
             </w:r>
-            <w:proofErr w:type="gramStart"/>
-            <w:r>
-              <w:rPr>
-                <w:rFonts w:ascii="Preeti" w:hAnsi="Preeti"/>
-                <w:b/>
-                <w:bCs/>
-                <w:sz w:val="32"/>
-                <w:szCs w:val="32"/>
-              </w:rPr>
-              <w:t>] ;xL</w:t>
-            </w:r>
-            <w:proofErr w:type="gramEnd"/>
             <w:r>
               <w:rPr>
                 <w:rFonts w:ascii="Times New Roman" w:hAnsi="Times New Roman"/>
@@ -1165,20 +952,8 @@
                 <w:sz w:val="32"/>
                 <w:szCs w:val="32"/>
               </w:rPr>
-              <w:t>k/LIfssf</w:t>
+              <w:t>k/LIfssf] ;xL</w:t>
             </w:r>
-            <w:proofErr w:type="gramStart"/>
-            <w:r>
-              <w:rPr>
-                <w:rFonts w:ascii="Preeti" w:hAnsi="Preeti"/>
-                <w:b/>
-                <w:bCs/>
-                <w:sz w:val="32"/>
-                <w:szCs w:val="32"/>
-              </w:rPr>
-              <w:t>] ;xL</w:t>
-            </w:r>
-            <w:proofErr w:type="gramEnd"/>
             <w:r>
               <w:rPr>
                 <w:rFonts w:ascii="Times New Roman" w:hAnsi="Times New Roman"/>
@@ -1209,93 +984,15 @@
           <w:szCs w:val="34"/>
         </w:rPr>
       </w:pPr>
-      <w:proofErr w:type="gramStart"/>
-      <w:r>
-        <w:rPr>
-          <w:rFonts w:ascii="Preeti" w:hAnsi="Preeti"/>
-          <w:b/>
-          <w:bCs/>
-          <w:sz w:val="34"/>
-          <w:szCs w:val="34"/>
-        </w:rPr>
-        <w:t>!_</w:t>
-      </w:r>
-      <w:proofErr w:type="gramEnd"/>
-      <w:r>
-        <w:rPr>
-          <w:rFonts w:ascii="Preeti" w:hAnsi="Preeti"/>
-          <w:b/>
-          <w:bCs/>
-          <w:sz w:val="34"/>
-          <w:szCs w:val="34"/>
-        </w:rPr>
-        <w:t xml:space="preserve"> tn lbOPsf] cg'R</w:t>
-      </w:r>
-      <w:proofErr w:type="gramStart"/>
-      <w:r>
-        <w:rPr>
-          <w:rFonts w:ascii="Preeti" w:hAnsi="Preeti"/>
-          <w:b/>
-          <w:bCs/>
-          <w:sz w:val="34"/>
-          <w:szCs w:val="34"/>
-        </w:rPr>
-        <w:t>5]b</w:t>
-      </w:r>
-      <w:proofErr w:type="gramEnd"/>
-      <w:r>
-        <w:rPr>
-          <w:rFonts w:ascii="Preeti" w:hAnsi="Preeti"/>
-          <w:b/>
-          <w:bCs/>
-          <w:sz w:val="34"/>
-          <w:szCs w:val="34"/>
-        </w:rPr>
-        <w:t xml:space="preserve"> k9</w:t>
-      </w:r>
-      <w:proofErr w:type="gramStart"/>
-      <w:r>
-        <w:rPr>
-          <w:rFonts w:ascii="Preeti" w:hAnsi="Preeti"/>
-          <w:b/>
-          <w:bCs/>
-          <w:sz w:val="34"/>
-          <w:szCs w:val="34"/>
-        </w:rPr>
-        <w:t>L ;f</w:t>
-      </w:r>
-      <w:proofErr w:type="gramEnd"/>
-      <w:r>
-        <w:rPr>
-          <w:rFonts w:ascii="Preeti" w:hAnsi="Preeti"/>
-          <w:b/>
-          <w:bCs/>
-          <w:sz w:val="34"/>
-          <w:szCs w:val="34"/>
-        </w:rPr>
-        <w:t xml:space="preserve">]lwPsf] k|Zgsf] pQ/ </w:t>
-      </w:r>
-      <w:proofErr w:type="gramStart"/>
-      <w:r>
-        <w:rPr>
-          <w:rFonts w:ascii="Preeti" w:hAnsi="Preeti"/>
-          <w:b/>
-          <w:bCs/>
-          <w:sz w:val="34"/>
-          <w:szCs w:val="34"/>
-        </w:rPr>
-        <w:t>n]Vg'xf];\</w:t>
-      </w:r>
-      <w:proofErr w:type="gramEnd"/>
-      <w:r>
-        <w:rPr>
-          <w:rFonts w:ascii="Preeti" w:hAnsi="Preeti"/>
-          <w:b/>
-          <w:bCs/>
-          <w:sz w:val="34"/>
-          <w:szCs w:val="34"/>
-        </w:rPr>
-        <w:t xml:space="preserve"> .</w:t>
+      <w:r>
+        <w:rPr>
+          <w:rFonts w:ascii="Preeti" w:hAnsi="Preeti"/>
+          <w:b/>
+          <w:bCs/>
+          <w:sz w:val="34"/>
+          <w:szCs w:val="34"/>
+        </w:rPr>
+        <w:t>!_ tn lbOPsf] cg'R5]b k9L ;f]lwPsf] k|Zgsf] pQ/ n]Vg'xf];\ .</w:t>
       </w:r>
       <w:r>
         <w:rPr>
@@ -1387,349 +1084,7 @@
           <w:sz w:val="34"/>
           <w:szCs w:val="34"/>
         </w:rPr>
-        <w:t>Pp6f 7"nf] hª\un lyof</w:t>
-      </w:r>
-      <w:proofErr w:type="gramStart"/>
-      <w:r>
-        <w:rPr>
-          <w:rFonts w:ascii="Preeti" w:hAnsi="Preeti"/>
-          <w:sz w:val="34"/>
-          <w:szCs w:val="34"/>
-        </w:rPr>
-        <w:t>] .</w:t>
-      </w:r>
-      <w:proofErr w:type="gramEnd"/>
-      <w:r>
-        <w:rPr>
-          <w:rFonts w:ascii="Preeti" w:hAnsi="Preeti"/>
-          <w:sz w:val="34"/>
-          <w:szCs w:val="34"/>
-        </w:rPr>
-        <w:t xml:space="preserve"> hª\undf Pp6f af3 lyof</w:t>
-      </w:r>
-      <w:proofErr w:type="gramStart"/>
-      <w:r>
-        <w:rPr>
-          <w:rFonts w:ascii="Preeti" w:hAnsi="Preeti"/>
-          <w:sz w:val="34"/>
-          <w:szCs w:val="34"/>
-        </w:rPr>
-        <w:t>] .</w:t>
-      </w:r>
-      <w:proofErr w:type="gramEnd"/>
-      <w:r>
-        <w:rPr>
-          <w:rFonts w:ascii="Preeti" w:hAnsi="Preeti"/>
-          <w:sz w:val="34"/>
-          <w:szCs w:val="34"/>
-        </w:rPr>
-        <w:t xml:space="preserve"> af3 l</w:t>
-      </w:r>
-      <w:proofErr w:type="gramStart"/>
-      <w:r>
-        <w:rPr>
-          <w:rFonts w:ascii="Preeti" w:hAnsi="Preeti"/>
-          <w:sz w:val="34"/>
-          <w:szCs w:val="34"/>
-        </w:rPr>
-        <w:t>/;fxf</w:t>
-      </w:r>
-      <w:proofErr w:type="gramEnd"/>
-      <w:r>
-        <w:rPr>
-          <w:rFonts w:ascii="Preeti" w:hAnsi="Preeti"/>
-          <w:sz w:val="34"/>
-          <w:szCs w:val="34"/>
-        </w:rPr>
-        <w:t xml:space="preserve"> lyof</w:t>
-      </w:r>
-      <w:proofErr w:type="gramStart"/>
-      <w:r>
-        <w:rPr>
-          <w:rFonts w:ascii="Preeti" w:hAnsi="Preeti"/>
-          <w:sz w:val="34"/>
-          <w:szCs w:val="34"/>
-        </w:rPr>
-        <w:t>] .</w:t>
-      </w:r>
-      <w:proofErr w:type="gramEnd"/>
-      <w:r>
-        <w:rPr>
-          <w:rFonts w:ascii="Preeti" w:hAnsi="Preeti"/>
-          <w:sz w:val="34"/>
-          <w:szCs w:val="34"/>
-        </w:rPr>
-        <w:t xml:space="preserve"> af3 3d08L klg lyof</w:t>
-      </w:r>
-      <w:proofErr w:type="gramStart"/>
-      <w:r>
-        <w:rPr>
-          <w:rFonts w:ascii="Preeti" w:hAnsi="Preeti"/>
-          <w:sz w:val="34"/>
-          <w:szCs w:val="34"/>
-        </w:rPr>
-        <w:t>] .</w:t>
-      </w:r>
-      <w:proofErr w:type="gramEnd"/>
-      <w:r>
-        <w:rPr>
-          <w:rFonts w:ascii="Preeti" w:hAnsi="Preeti"/>
-          <w:sz w:val="34"/>
-          <w:szCs w:val="34"/>
-        </w:rPr>
-        <w:t xml:space="preserve"> af3 eGYof], d 7"nf] </w:t>
-      </w:r>
-      <w:proofErr w:type="gramStart"/>
-      <w:r>
-        <w:rPr>
-          <w:rFonts w:ascii="Preeti" w:hAnsi="Preeti"/>
-          <w:sz w:val="34"/>
-          <w:szCs w:val="34"/>
-        </w:rPr>
-        <w:t>x'F .</w:t>
-      </w:r>
-      <w:proofErr w:type="gramEnd"/>
-      <w:r>
-        <w:rPr>
-          <w:rFonts w:ascii="Preeti" w:hAnsi="Preeti"/>
-          <w:sz w:val="34"/>
-          <w:szCs w:val="34"/>
-        </w:rPr>
-        <w:t xml:space="preserve"> d /fd|f] 5</w:t>
-      </w:r>
-      <w:proofErr w:type="gramStart"/>
-      <w:r>
-        <w:rPr>
-          <w:rFonts w:ascii="Preeti" w:hAnsi="Preeti"/>
-          <w:sz w:val="34"/>
-          <w:szCs w:val="34"/>
-        </w:rPr>
-        <w:t>' .</w:t>
-      </w:r>
-      <w:proofErr w:type="gramEnd"/>
-      <w:r>
-        <w:rPr>
-          <w:rFonts w:ascii="Preeti" w:hAnsi="Preeti"/>
-          <w:sz w:val="34"/>
-          <w:szCs w:val="34"/>
-        </w:rPr>
-        <w:t xml:space="preserve"> </w:t>
-      </w:r>
-      <w:proofErr w:type="gramStart"/>
-      <w:r>
-        <w:rPr>
-          <w:rFonts w:ascii="Preeti" w:hAnsi="Preeti"/>
-          <w:sz w:val="34"/>
-          <w:szCs w:val="34"/>
-        </w:rPr>
-        <w:t>d ;a</w:t>
-      </w:r>
-      <w:proofErr w:type="gramEnd"/>
-      <w:r>
-        <w:rPr>
-          <w:rFonts w:ascii="Preeti" w:hAnsi="Preeti"/>
-          <w:sz w:val="34"/>
-          <w:szCs w:val="34"/>
-        </w:rPr>
-        <w:t>}eGbf l56f] s'b\</w:t>
-      </w:r>
-      <w:proofErr w:type="gramStart"/>
-      <w:r>
-        <w:rPr>
-          <w:rFonts w:ascii="Preeti" w:hAnsi="Preeti"/>
-          <w:sz w:val="34"/>
-          <w:szCs w:val="34"/>
-        </w:rPr>
-        <w:t>g ;S</w:t>
-      </w:r>
-      <w:proofErr w:type="gramEnd"/>
-      <w:r>
-        <w:rPr>
-          <w:rFonts w:ascii="Preeti" w:hAnsi="Preeti"/>
-          <w:sz w:val="34"/>
-          <w:szCs w:val="34"/>
-        </w:rPr>
-        <w:t>5</w:t>
-      </w:r>
-      <w:proofErr w:type="gramStart"/>
-      <w:r>
-        <w:rPr>
-          <w:rFonts w:ascii="Preeti" w:hAnsi="Preeti"/>
-          <w:sz w:val="34"/>
-          <w:szCs w:val="34"/>
-        </w:rPr>
-        <w:t>' .</w:t>
-      </w:r>
-      <w:proofErr w:type="gramEnd"/>
-      <w:r>
-        <w:rPr>
-          <w:rFonts w:ascii="Preeti" w:hAnsi="Preeti"/>
-          <w:sz w:val="34"/>
-          <w:szCs w:val="34"/>
-        </w:rPr>
-        <w:t xml:space="preserve"> </w:t>
-      </w:r>
-      <w:proofErr w:type="gramStart"/>
-      <w:r>
-        <w:rPr>
-          <w:rFonts w:ascii="Preeti" w:hAnsi="Preeti"/>
-          <w:sz w:val="34"/>
-          <w:szCs w:val="34"/>
-        </w:rPr>
-        <w:t>c?nfO{ dg</w:t>
-      </w:r>
-      <w:proofErr w:type="gramEnd"/>
-      <w:r>
-        <w:rPr>
-          <w:rFonts w:ascii="Preeti" w:hAnsi="Preeti"/>
-          <w:sz w:val="34"/>
-          <w:szCs w:val="34"/>
-        </w:rPr>
-        <w:t xml:space="preserve"> </w:t>
-      </w:r>
-      <w:proofErr w:type="gramStart"/>
-      <w:r>
-        <w:rPr>
-          <w:rFonts w:ascii="Preeti" w:hAnsi="Preeti"/>
-          <w:sz w:val="34"/>
-          <w:szCs w:val="34"/>
-        </w:rPr>
-        <w:t>kb}{</w:t>
-      </w:r>
-      <w:proofErr w:type="gramEnd"/>
-      <w:r>
-        <w:rPr>
-          <w:rFonts w:ascii="Preeti" w:hAnsi="Preeti"/>
-          <w:sz w:val="34"/>
-          <w:szCs w:val="34"/>
-        </w:rPr>
-        <w:t>gYof</w:t>
-      </w:r>
-      <w:proofErr w:type="gramStart"/>
-      <w:r>
-        <w:rPr>
-          <w:rFonts w:ascii="Preeti" w:hAnsi="Preeti"/>
-          <w:sz w:val="34"/>
-          <w:szCs w:val="34"/>
-        </w:rPr>
-        <w:t>] .</w:t>
-      </w:r>
-      <w:proofErr w:type="gramEnd"/>
-      <w:r>
-        <w:rPr>
-          <w:rFonts w:ascii="Preeti" w:hAnsi="Preeti"/>
-          <w:sz w:val="34"/>
-          <w:szCs w:val="34"/>
-        </w:rPr>
-        <w:t xml:space="preserve"> Ps k6s hª\undf 7"nf</w:t>
-      </w:r>
-      <w:proofErr w:type="gramStart"/>
-      <w:r>
-        <w:rPr>
-          <w:rFonts w:ascii="Preeti" w:hAnsi="Preeti"/>
-          <w:sz w:val="34"/>
-          <w:szCs w:val="34"/>
-        </w:rPr>
-        <w:t>] ;ef</w:t>
-      </w:r>
-      <w:proofErr w:type="gramEnd"/>
-      <w:r>
-        <w:rPr>
-          <w:rFonts w:ascii="Preeti" w:hAnsi="Preeti"/>
-          <w:sz w:val="34"/>
-          <w:szCs w:val="34"/>
-        </w:rPr>
-        <w:t xml:space="preserve"> </w:t>
-      </w:r>
-      <w:proofErr w:type="gramStart"/>
-      <w:r>
-        <w:rPr>
-          <w:rFonts w:ascii="Preeti" w:hAnsi="Preeti"/>
-          <w:sz w:val="34"/>
-          <w:szCs w:val="34"/>
-        </w:rPr>
-        <w:t>a:of] .</w:t>
-      </w:r>
-      <w:proofErr w:type="gramEnd"/>
-      <w:r>
-        <w:rPr>
-          <w:rFonts w:ascii="Preeti" w:hAnsi="Preeti"/>
-          <w:sz w:val="34"/>
-          <w:szCs w:val="34"/>
-        </w:rPr>
-        <w:t xml:space="preserve"> </w:t>
-      </w:r>
-      <w:proofErr w:type="gramStart"/>
-      <w:r>
-        <w:rPr>
-          <w:rFonts w:ascii="Preeti" w:hAnsi="Preeti"/>
-          <w:sz w:val="34"/>
-          <w:szCs w:val="34"/>
-        </w:rPr>
-        <w:t>;efdf ;a</w:t>
-      </w:r>
-      <w:proofErr w:type="gramEnd"/>
-      <w:r>
-        <w:rPr>
-          <w:rFonts w:ascii="Preeti" w:hAnsi="Preeti"/>
-          <w:sz w:val="34"/>
-          <w:szCs w:val="34"/>
-        </w:rPr>
-        <w:t xml:space="preserve">} hª\unL hgfj/x? cfPsf </w:t>
-      </w:r>
-      <w:proofErr w:type="gramStart"/>
-      <w:r>
-        <w:rPr>
-          <w:rFonts w:ascii="Preeti" w:hAnsi="Preeti"/>
-          <w:sz w:val="34"/>
-          <w:szCs w:val="34"/>
-        </w:rPr>
-        <w:t>lyP .</w:t>
-      </w:r>
-      <w:proofErr w:type="gramEnd"/>
-      <w:r>
-        <w:rPr>
-          <w:rFonts w:ascii="Preeti" w:hAnsi="Preeti"/>
-          <w:sz w:val="34"/>
-          <w:szCs w:val="34"/>
-        </w:rPr>
-        <w:t xml:space="preserve"> hª\undf bf}8 k|</w:t>
-      </w:r>
-      <w:proofErr w:type="gramStart"/>
-      <w:r>
-        <w:rPr>
-          <w:rFonts w:ascii="Preeti" w:hAnsi="Preeti"/>
-          <w:sz w:val="34"/>
-          <w:szCs w:val="34"/>
-        </w:rPr>
-        <w:t>ltof]lutf</w:t>
-      </w:r>
-      <w:proofErr w:type="gramEnd"/>
-      <w:r>
-        <w:rPr>
-          <w:rFonts w:ascii="Preeti" w:hAnsi="Preeti"/>
-          <w:sz w:val="34"/>
-          <w:szCs w:val="34"/>
-        </w:rPr>
-        <w:t xml:space="preserve"> x'g] eof</w:t>
-      </w:r>
-      <w:proofErr w:type="gramStart"/>
-      <w:r>
-        <w:rPr>
-          <w:rFonts w:ascii="Preeti" w:hAnsi="Preeti"/>
-          <w:sz w:val="34"/>
-          <w:szCs w:val="34"/>
-        </w:rPr>
-        <w:t>] .</w:t>
-      </w:r>
-      <w:proofErr w:type="gramEnd"/>
-      <w:r>
-        <w:rPr>
-          <w:rFonts w:ascii="Preeti" w:hAnsi="Preeti"/>
-          <w:sz w:val="34"/>
-          <w:szCs w:val="34"/>
-        </w:rPr>
-        <w:t xml:space="preserve"> </w:t>
+        <w:t xml:space="preserve">Pp6f 7"nf] hª\un lyof] . hª\undf Pp6f af3 lyof] . af3 l/;fxf lyof] . af3 3d08L klg lyof] . af3 eGYof], d 7"nf] x'F . d /fd|f] 5' . d ;a}eGbf l56f] s'b\g ;S5' . c?nfO{ dg kb}{gYof] . Ps k6s hª\undf 7"nf] ;ef a:of] . ;efdf ;a} hª\unL hgfj/x? cfPsf lyP . hª\undf bf}8 k|ltof]lutf x'g] eof] . </w:t>
       </w:r>
     </w:p>
     <w:p>
@@ -1963,29 +1318,7 @@
           <w:sz w:val="34"/>
           <w:szCs w:val="34"/>
         </w:rPr>
-        <w:t>@_ hf]8f ldnfpg'xf</w:t>
-      </w:r>
-      <w:proofErr w:type="gramStart"/>
-      <w:r>
-        <w:rPr>
-          <w:rFonts w:ascii="Preeti" w:hAnsi="Preeti"/>
-          <w:b/>
-          <w:bCs/>
-          <w:sz w:val="34"/>
-          <w:szCs w:val="34"/>
-        </w:rPr>
-        <w:t>];\</w:t>
-      </w:r>
-      <w:proofErr w:type="gramEnd"/>
-      <w:r>
-        <w:rPr>
-          <w:rFonts w:ascii="Preeti" w:hAnsi="Preeti"/>
-          <w:b/>
-          <w:bCs/>
-          <w:sz w:val="34"/>
-          <w:szCs w:val="34"/>
-        </w:rPr>
-        <w:t xml:space="preserve"> .</w:t>
+        <w:t>@_ hf]8f ldnfpg'xf];\ .</w:t>
       </w:r>
       <w:r>
         <w:rPr>
@@ -2121,23 +1454,13 @@
           <w:szCs w:val="34"/>
         </w:rPr>
       </w:pPr>
-      <w:proofErr w:type="gramStart"/>
-      <w:r>
-        <w:rPr>
-          <w:rFonts w:ascii="Preeti" w:hAnsi="Preeti"/>
-          <w:sz w:val="34"/>
-          <w:szCs w:val="34"/>
-        </w:rPr>
-        <w:t>e]b</w:t>
-      </w:r>
-      <w:proofErr w:type="gramEnd"/>
-      <w:r>
-        <w:rPr>
-          <w:rFonts w:ascii="Preeti" w:hAnsi="Preeti"/>
-          <w:sz w:val="34"/>
-          <w:szCs w:val="34"/>
-        </w:rPr>
-        <w:t>\efj</w:t>
+      <w:r>
+        <w:rPr>
+          <w:rFonts w:ascii="Preeti" w:hAnsi="Preeti"/>
+          <w:sz w:val="34"/>
+          <w:szCs w:val="34"/>
+        </w:rPr>
+        <w:t>e]b\efj</w:t>
       </w:r>
       <w:r>
         <w:rPr>
@@ -2279,84 +1602,56 @@
           <w:sz w:val="34"/>
           <w:szCs w:val="34"/>
         </w:rPr>
-        <w:t>k|of; ug</w:t>
-      </w:r>
-      <w:proofErr w:type="gramStart"/>
-      <w:r>
-        <w:rPr>
-          <w:rFonts w:ascii="Preeti" w:hAnsi="Preeti"/>
-          <w:sz w:val="34"/>
-          <w:szCs w:val="34"/>
-        </w:rPr>
-        <w:t xml:space="preserve">'{ </w:t>
-      </w:r>
-      <w:r>
-        <w:rPr>
-          <w:rFonts w:ascii="Preeti" w:hAnsi="Preeti"/>
-          <w:sz w:val="34"/>
-          <w:szCs w:val="34"/>
-        </w:rPr>
-        <w:tab/>
-      </w:r>
-      <w:proofErr w:type="gramEnd"/>
-      <w:r>
-        <w:rPr>
-          <w:rFonts w:ascii="Preeti" w:hAnsi="Preeti"/>
-          <w:sz w:val="34"/>
-          <w:szCs w:val="34"/>
-        </w:rPr>
-        <w:tab/>
-      </w:r>
-      <w:r>
-        <w:rPr>
-          <w:rFonts w:ascii="Preeti" w:hAnsi="Preeti"/>
-          <w:sz w:val="34"/>
-          <w:szCs w:val="34"/>
-        </w:rPr>
-        <w:tab/>
-      </w:r>
-      <w:r>
-        <w:rPr>
-          <w:rFonts w:ascii="Preeti" w:hAnsi="Preeti"/>
-          <w:sz w:val="34"/>
-          <w:szCs w:val="34"/>
-        </w:rPr>
-        <w:tab/>
-      </w:r>
-      <w:r>
-        <w:rPr>
-          <w:rFonts w:ascii="Preeti" w:hAnsi="Preeti"/>
-          <w:sz w:val="34"/>
-          <w:szCs w:val="34"/>
-        </w:rPr>
-        <w:tab/>
-      </w:r>
-      <w:r>
-        <w:rPr>
-          <w:rFonts w:ascii="Preeti" w:hAnsi="Preeti"/>
-          <w:sz w:val="34"/>
-          <w:szCs w:val="34"/>
-        </w:rPr>
-        <w:tab/>
-        <w:t xml:space="preserve">ef/L </w:t>
-      </w:r>
-      <w:proofErr w:type="gramStart"/>
-      <w:r>
-        <w:rPr>
-          <w:rFonts w:ascii="Preeti" w:hAnsi="Preeti"/>
-          <w:sz w:val="34"/>
-          <w:szCs w:val="34"/>
-        </w:rPr>
-        <w:t>af]Sg</w:t>
-      </w:r>
-      <w:proofErr w:type="gramEnd"/>
-      <w:r>
-        <w:rPr>
-          <w:rFonts w:ascii="Preeti" w:hAnsi="Preeti"/>
-          <w:sz w:val="34"/>
-          <w:szCs w:val="34"/>
-        </w:rPr>
-        <w:t xml:space="preserve">] </w:t>
+        <w:t xml:space="preserve">k|of; ug'{ </w:t>
+      </w:r>
+      <w:r>
+        <w:rPr>
+          <w:rFonts w:ascii="Preeti" w:hAnsi="Preeti"/>
+          <w:sz w:val="34"/>
+          <w:szCs w:val="34"/>
+        </w:rPr>
+        <w:tab/>
+      </w:r>
+      <w:r>
+        <w:rPr>
+          <w:rFonts w:ascii="Preeti" w:hAnsi="Preeti"/>
+          <w:sz w:val="34"/>
+          <w:szCs w:val="34"/>
+        </w:rPr>
+        <w:tab/>
+      </w:r>
+      <w:r>
+        <w:rPr>
+          <w:rFonts w:ascii="Preeti" w:hAnsi="Preeti"/>
+          <w:sz w:val="34"/>
+          <w:szCs w:val="34"/>
+        </w:rPr>
+        <w:tab/>
+      </w:r>
+      <w:r>
+        <w:rPr>
+          <w:rFonts w:ascii="Preeti" w:hAnsi="Preeti"/>
+          <w:sz w:val="34"/>
+          <w:szCs w:val="34"/>
+        </w:rPr>
+        <w:tab/>
+      </w:r>
+      <w:r>
+        <w:rPr>
+          <w:rFonts w:ascii="Preeti" w:hAnsi="Preeti"/>
+          <w:sz w:val="34"/>
+          <w:szCs w:val="34"/>
+        </w:rPr>
+        <w:tab/>
+      </w:r>
+      <w:r>
+        <w:rPr>
+          <w:rFonts w:ascii="Preeti" w:hAnsi="Preeti"/>
+          <w:sz w:val="34"/>
+          <w:szCs w:val="34"/>
+        </w:rPr>
+        <w:tab/>
+        <w:t xml:space="preserve">ef/L af]Sg] </w:t>
       </w:r>
     </w:p>
     <w:p>
@@ -2427,50 +1722,53 @@
           <w:szCs w:val="34"/>
         </w:rPr>
         <w:tab/>
-      </w:r>
-      <w:proofErr w:type="gramStart"/>
-      <w:r>
-        <w:rPr>
-          <w:rFonts w:ascii="Preeti" w:hAnsi="Preeti"/>
-          <w:sz w:val="34"/>
-          <w:szCs w:val="34"/>
-        </w:rPr>
-        <w:t>sf]lz</w:t>
-      </w:r>
-      <w:proofErr w:type="gramEnd"/>
-      <w:r>
-        <w:rPr>
-          <w:rFonts w:ascii="Preeti" w:hAnsi="Preeti"/>
-          <w:sz w:val="34"/>
-          <w:szCs w:val="34"/>
-        </w:rPr>
-        <w:t xml:space="preserve">; ug'{ </w:t>
-      </w:r>
-    </w:p>
-    <w:p>
-      <w:pPr>
-        <w:tabs>
-          <w:tab w:val="left" w:pos="1440"/>
-        </w:tabs>
-        <w:spacing w:after="0" w:line="360" w:lineRule="auto"/>
-        <w:jc w:val="both"/>
-        <w:rPr>
-          <w:rFonts w:ascii="Preeti" w:hAnsi="Preeti"/>
-          <w:b/>
-          <w:bCs/>
-          <w:sz w:val="34"/>
-          <w:szCs w:val="34"/>
-        </w:rPr>
-      </w:pPr>
-      <w:r>
-        <w:rPr>
-          <w:rFonts w:ascii="Preeti" w:hAnsi="Preeti"/>
-          <w:b/>
-          <w:bCs/>
-          <w:sz w:val="34"/>
-          <w:szCs w:val="34"/>
-        </w:rPr>
-        <w:t>#_ 7Ls eP -</w:t>
+        <w:t xml:space="preserve">sf]lz; ug'{ </w:t>
+      </w:r>
+    </w:p>
+    <w:p>
+      <w:pPr>
+        <w:tabs>
+          <w:tab w:val="left" w:pos="1440"/>
+        </w:tabs>
+        <w:spacing w:after="0" w:line="360" w:lineRule="auto"/>
+        <w:jc w:val="both"/>
+        <w:rPr>
+          <w:rFonts w:ascii="Preeti" w:hAnsi="Preeti"/>
+          <w:b/>
+          <w:bCs/>
+          <w:sz w:val="34"/>
+          <w:szCs w:val="34"/>
+        </w:rPr>
+      </w:pPr>
+      <w:r>
+        <w:rPr>
+          <w:rFonts w:ascii="Preeti" w:hAnsi="Preeti"/>
+          <w:b/>
+          <w:bCs/>
+          <w:sz w:val="34"/>
+          <w:szCs w:val="34"/>
+        </w:rPr>
+        <w:t xml:space="preserve">#_ </w:t>
+      </w:r>
+      <w:r>
+        <w:rPr>
+          <w:rFonts w:ascii="Preeti" w:hAnsi="Preeti"/>
+          <w:b/>
+          <w:bCs/>
+          <w:sz w:val="34"/>
+          <w:szCs w:val="34"/>
+        </w:rPr>
+        <w:t>l</w:t>
+      </w:r>
+      <w:r>
+        <w:rPr>
+          <w:rFonts w:ascii="Preeti" w:hAnsi="Preeti"/>
+          <w:b/>
+          <w:bCs/>
+          <w:sz w:val="34"/>
+          <w:szCs w:val="34"/>
+        </w:rPr>
+        <w:t>7s eP -</w:t>
       </w:r>
       <w:r>
         <w:rPr>
@@ -2490,7 +1788,27 @@
           <w:sz w:val="34"/>
           <w:szCs w:val="34"/>
         </w:rPr>
-        <w:t>_ / a]7Ls eP -</w:t>
+        <w:t>_ / a]</w:t>
+      </w:r>
+      <w:r>
+        <w:rPr>
+          <w:rFonts w:ascii="Preeti" w:hAnsi="Preeti"/>
+          <w:b/>
+          <w:bCs/>
+          <w:sz w:val="34"/>
+          <w:szCs w:val="34"/>
+        </w:rPr>
+        <w:t>l</w:t>
+      </w:r>
+      <w:r>
+        <w:rPr>
+          <w:rFonts w:ascii="Preeti" w:hAnsi="Preeti"/>
+          <w:b/>
+          <w:bCs/>
+          <w:sz w:val="34"/>
+          <w:szCs w:val="34"/>
+        </w:rPr>
+        <w:t>7s eP -</w:t>
       </w:r>
       <w:r>
         <w:rPr>
@@ -2510,29 +1828,7 @@
           <w:sz w:val="34"/>
           <w:szCs w:val="34"/>
         </w:rPr>
-        <w:t>_ nufpg'xf</w:t>
-      </w:r>
-      <w:proofErr w:type="gramStart"/>
-      <w:r>
-        <w:rPr>
-          <w:rFonts w:ascii="Preeti" w:hAnsi="Preeti"/>
-          <w:b/>
-          <w:bCs/>
-          <w:sz w:val="34"/>
-          <w:szCs w:val="34"/>
-        </w:rPr>
-        <w:t>];\</w:t>
-      </w:r>
-      <w:proofErr w:type="gramEnd"/>
-      <w:r>
-        <w:rPr>
-          <w:rFonts w:ascii="Preeti" w:hAnsi="Preeti"/>
-          <w:b/>
-          <w:bCs/>
-          <w:sz w:val="34"/>
-          <w:szCs w:val="34"/>
-        </w:rPr>
-        <w:t xml:space="preserve"> .</w:t>
+        <w:t>_ nufpg'xf];\ .</w:t>
       </w:r>
       <w:r>
         <w:rPr>
@@ -2641,260 +1937,509 @@
       <w:r>
         <w:rPr>
           <w:rFonts w:ascii="Preeti" w:hAnsi="Preeti"/>
-          <w:sz w:val="34"/>
-          <w:szCs w:val="34"/>
-        </w:rPr>
-        <w:t xml:space="preserve">s_ laNnL / </w:t>
-      </w:r>
-      <w:proofErr w:type="gramStart"/>
-      <w:r>
-        <w:rPr>
-          <w:rFonts w:ascii="Preeti" w:hAnsi="Preeti"/>
-          <w:sz w:val="34"/>
-          <w:szCs w:val="34"/>
-        </w:rPr>
-        <w:t>l;NnL</w:t>
-      </w:r>
-      <w:proofErr w:type="gramEnd"/>
-      <w:r>
-        <w:rPr>
-          <w:rFonts w:ascii="Preeti" w:hAnsi="Preeti"/>
-          <w:sz w:val="34"/>
-          <w:szCs w:val="34"/>
-        </w:rPr>
-        <w:t xml:space="preserve"> 1fgL </w:t>
-      </w:r>
-      <w:proofErr w:type="gramStart"/>
-      <w:r>
-        <w:rPr>
-          <w:rFonts w:ascii="Preeti" w:hAnsi="Preeti"/>
-          <w:sz w:val="34"/>
-          <w:szCs w:val="34"/>
-        </w:rPr>
-        <w:t>lyP .</w:t>
-      </w:r>
-      <w:proofErr w:type="gramEnd"/>
-      <w:r>
-        <w:rPr>
-          <w:rFonts w:ascii="Preeti" w:hAnsi="Preeti"/>
-          <w:sz w:val="34"/>
-          <w:szCs w:val="34"/>
-        </w:rPr>
-        <w:t xml:space="preserve"> =================</w:t>
-      </w:r>
-    </w:p>
-    <w:p>
-      <w:pPr>
-        <w:tabs>
-          <w:tab w:val="left" w:pos="1440"/>
-        </w:tabs>
-        <w:spacing w:after="0" w:line="360" w:lineRule="auto"/>
-        <w:jc w:val="both"/>
-        <w:rPr>
-          <w:rFonts w:ascii="Preeti" w:hAnsi="Preeti"/>
-          <w:sz w:val="34"/>
-          <w:szCs w:val="34"/>
-        </w:rPr>
-      </w:pPr>
-      <w:r>
-        <w:rPr>
-          <w:rFonts w:ascii="Preeti" w:hAnsi="Preeti"/>
-          <w:sz w:val="34"/>
-          <w:szCs w:val="34"/>
-        </w:rPr>
-        <w:t xml:space="preserve">v_ ufpFvfg] syf </w:t>
-      </w:r>
-      <w:proofErr w:type="gramStart"/>
-      <w:r>
-        <w:rPr>
-          <w:rFonts w:ascii="Preeti" w:hAnsi="Preeti"/>
-          <w:sz w:val="34"/>
-          <w:szCs w:val="34"/>
-        </w:rPr>
-        <w:t>v]Nbf</w:t>
-      </w:r>
-      <w:proofErr w:type="gramEnd"/>
-      <w:r>
-        <w:rPr>
-          <w:rFonts w:ascii="Preeti" w:hAnsi="Preeti"/>
-          <w:sz w:val="34"/>
-          <w:szCs w:val="34"/>
-        </w:rPr>
-        <w:t xml:space="preserve"> lgod rflxG</w:t>
-      </w:r>
-      <w:proofErr w:type="gramStart"/>
-      <w:r>
-        <w:rPr>
-          <w:rFonts w:ascii="Preeti" w:hAnsi="Preeti"/>
-          <w:sz w:val="34"/>
-          <w:szCs w:val="34"/>
-        </w:rPr>
-        <w:t>5 .</w:t>
-      </w:r>
-      <w:proofErr w:type="gramEnd"/>
-      <w:r>
-        <w:rPr>
-          <w:rFonts w:ascii="Preeti" w:hAnsi="Preeti"/>
-          <w:sz w:val="34"/>
-          <w:szCs w:val="34"/>
-        </w:rPr>
-        <w:t xml:space="preserve"> ============</w:t>
-      </w:r>
-    </w:p>
-    <w:p>
-      <w:pPr>
-        <w:tabs>
-          <w:tab w:val="left" w:pos="1440"/>
-        </w:tabs>
-        <w:spacing w:after="0" w:line="360" w:lineRule="auto"/>
-        <w:jc w:val="both"/>
-        <w:rPr>
-          <w:rFonts w:ascii="Preeti" w:hAnsi="Preeti"/>
-          <w:sz w:val="34"/>
-          <w:szCs w:val="34"/>
-        </w:rPr>
-      </w:pPr>
-      <w:r>
-        <w:rPr>
-          <w:rFonts w:ascii="Preeti" w:hAnsi="Preeti"/>
-          <w:sz w:val="34"/>
-          <w:szCs w:val="34"/>
-        </w:rPr>
-        <w:t>u_ k</w:t>
-      </w:r>
-      <w:proofErr w:type="gramStart"/>
-      <w:r>
-        <w:rPr>
-          <w:rFonts w:ascii="Preeti" w:hAnsi="Preeti"/>
-          <w:sz w:val="34"/>
-          <w:szCs w:val="34"/>
-        </w:rPr>
-        <w:t>/]jfn</w:t>
-      </w:r>
-      <w:proofErr w:type="gramEnd"/>
-      <w:r>
-        <w:rPr>
-          <w:rFonts w:ascii="Preeti" w:hAnsi="Preeti"/>
-          <w:sz w:val="34"/>
-          <w:szCs w:val="34"/>
-        </w:rPr>
-        <w:t xml:space="preserve">] 3fF; </w:t>
-      </w:r>
-      <w:proofErr w:type="gramStart"/>
-      <w:r>
-        <w:rPr>
-          <w:rFonts w:ascii="Preeti" w:hAnsi="Preeti"/>
-          <w:sz w:val="34"/>
-          <w:szCs w:val="34"/>
-        </w:rPr>
-        <w:t>vfGt .</w:t>
-      </w:r>
-      <w:proofErr w:type="gramEnd"/>
-      <w:r>
-        <w:rPr>
-          <w:rFonts w:ascii="Preeti" w:hAnsi="Preeti"/>
-          <w:sz w:val="34"/>
-          <w:szCs w:val="34"/>
-        </w:rPr>
-        <w:t xml:space="preserve"> =================</w:t>
-      </w:r>
-    </w:p>
-    <w:p>
-      <w:pPr>
-        <w:tabs>
-          <w:tab w:val="left" w:pos="1440"/>
-        </w:tabs>
-        <w:spacing w:after="0" w:line="360" w:lineRule="auto"/>
-        <w:jc w:val="both"/>
-        <w:rPr>
-          <w:rFonts w:ascii="Preeti" w:hAnsi="Preeti"/>
-          <w:sz w:val="34"/>
-          <w:szCs w:val="34"/>
-        </w:rPr>
-      </w:pPr>
-      <w:r>
-        <w:rPr>
-          <w:rFonts w:ascii="Preeti" w:hAnsi="Preeti"/>
-          <w:sz w:val="34"/>
-          <w:szCs w:val="34"/>
-        </w:rPr>
-        <w:t>3_ Ps dlxgfdf tL; lbg x'G</w:t>
-      </w:r>
-      <w:proofErr w:type="gramStart"/>
-      <w:r>
-        <w:rPr>
-          <w:rFonts w:ascii="Preeti" w:hAnsi="Preeti"/>
-          <w:sz w:val="34"/>
-          <w:szCs w:val="34"/>
-        </w:rPr>
-        <w:t>5 .</w:t>
-      </w:r>
-      <w:proofErr w:type="gramEnd"/>
-      <w:r>
-        <w:rPr>
-          <w:rFonts w:ascii="Preeti" w:hAnsi="Preeti"/>
-          <w:sz w:val="34"/>
-          <w:szCs w:val="34"/>
-        </w:rPr>
-        <w:t xml:space="preserve"> ============</w:t>
-      </w:r>
-    </w:p>
-    <w:p>
-      <w:pPr>
-        <w:tabs>
-          <w:tab w:val="left" w:pos="1440"/>
-        </w:tabs>
-        <w:spacing w:after="0" w:line="360" w:lineRule="auto"/>
-        <w:jc w:val="both"/>
-        <w:rPr>
-          <w:rFonts w:ascii="Preeti" w:hAnsi="Preeti"/>
-          <w:sz w:val="34"/>
-          <w:szCs w:val="34"/>
-        </w:rPr>
-      </w:pPr>
-      <w:r>
-        <w:rPr>
-          <w:rFonts w:ascii="Preeti" w:hAnsi="Preeti"/>
-          <w:sz w:val="34"/>
-          <w:szCs w:val="34"/>
-        </w:rPr>
-        <w:t>ª_ lj3</w:t>
-      </w:r>
-      <w:proofErr w:type="gramStart"/>
-      <w:r>
-        <w:rPr>
-          <w:rFonts w:ascii="Preeti" w:hAnsi="Preeti"/>
-          <w:sz w:val="34"/>
-          <w:szCs w:val="34"/>
-        </w:rPr>
-        <w:t>f ;DklQ</w:t>
-      </w:r>
-      <w:proofErr w:type="gramEnd"/>
-      <w:r>
-        <w:rPr>
-          <w:rFonts w:ascii="Preeti" w:hAnsi="Preeti"/>
-          <w:sz w:val="34"/>
-          <w:szCs w:val="34"/>
-        </w:rPr>
-        <w:t xml:space="preserve"> /x]</w:t>
-      </w:r>
-      <w:proofErr w:type="gramStart"/>
-      <w:r>
-        <w:rPr>
-          <w:rFonts w:ascii="Preeti" w:hAnsi="Preeti"/>
-          <w:sz w:val="34"/>
-          <w:szCs w:val="34"/>
-        </w:rPr>
-        <w:t>5 .</w:t>
-      </w:r>
-      <w:proofErr w:type="gramEnd"/>
-      <w:r>
-        <w:rPr>
-          <w:rFonts w:ascii="Preeti" w:hAnsi="Preeti"/>
-          <w:sz w:val="34"/>
-          <w:szCs w:val="34"/>
-        </w:rPr>
-        <w:t xml:space="preserve"> ===============</w:t>
+          <w:noProof/>
+          <w:sz w:val="34"/>
+          <w:szCs w:val="34"/>
+          <w14:ligatures w14:val="standardContextual"/>
+        </w:rPr>
+        <mc:AlternateContent>
+          <mc:Choice Requires="wps">
+            <w:drawing>
+              <wp:anchor distT="0" distB="0" distL="114300" distR="114300" simplePos="0" relativeHeight="251669504" behindDoc="0" locked="0" layoutInCell="1" allowOverlap="1" wp14:anchorId="7A468A5B" wp14:editId="203A923E">
+                <wp:simplePos x="0" y="0"/>
+                <wp:positionH relativeFrom="column">
+                  <wp:posOffset>2592070</wp:posOffset>
+                </wp:positionH>
+                <wp:positionV relativeFrom="paragraph">
+                  <wp:posOffset>316453</wp:posOffset>
+                </wp:positionV>
+                <wp:extent cx="967839" cy="267195"/>
+                <wp:effectExtent l="0" t="0" r="22860" b="19050"/>
+                <wp:wrapNone/>
+                <wp:docPr id="828686197" name="Rectangle 7"/>
+                <wp:cNvGraphicFramePr/>
+                <a:graphic xmlns:a="http://schemas.openxmlformats.org/drawingml/2006/main">
+                  <a:graphicData uri="http://schemas.microsoft.com/office/word/2010/wordprocessingShape">
+                    <wps:wsp>
+                      <wps:cNvSpPr/>
+                      <wps:spPr>
+                        <a:xfrm>
+                          <a:off x="0" y="0"/>
+                          <a:ext cx="967839" cy="267195"/>
+                        </a:xfrm>
+                        <a:prstGeom prst="rect">
+                          <a:avLst/>
+                        </a:prstGeom>
+                        <a:noFill/>
+                        <a:ln>
+                          <a:solidFill>
+                            <a:schemeClr val="tx1"/>
+                          </a:solidFill>
+                        </a:ln>
+                        <a:effectLst/>
+                      </wps:spPr>
+                      <wps:style>
+                        <a:lnRef idx="2">
+                          <a:schemeClr val="accent1">
+                            <a:shade val="15000"/>
+                          </a:schemeClr>
+                        </a:lnRef>
+                        <a:fillRef idx="1">
+                          <a:schemeClr val="accent1"/>
+                        </a:fillRef>
+                        <a:effectRef idx="0">
+                          <a:schemeClr val="accent1"/>
+                        </a:effectRef>
+                        <a:fontRef idx="minor">
+                          <a:schemeClr val="lt1"/>
+                        </a:fontRef>
+                      </wps:style>
+                      <wps:bodyPr rot="0" spcFirstLastPara="0" vertOverflow="overflow" horzOverflow="overflow" vert="horz" wrap="square" lIns="91440" tIns="45720" rIns="91440" bIns="45720" numCol="1" spcCol="0" rtlCol="0" fromWordArt="0" anchor="ctr" anchorCtr="0" forceAA="0" compatLnSpc="1">
+                        <a:prstTxWarp prst="textNoShape">
+                          <a:avLst/>
+                        </a:prstTxWarp>
+                        <a:noAutofit/>
+                      </wps:bodyPr>
+                    </wps:wsp>
+                  </a:graphicData>
+                </a:graphic>
+              </wp:anchor>
+            </w:drawing>
+          </mc:Choice>
+          <mc:Fallback>
+            <w:pict>
+              <v:rect w14:anchorId="4950A591" id="Rectangle 7" o:spid="_x0000_s1026" style="position:absolute;margin-left:204.1pt;margin-top:24.9pt;width:76.2pt;height:21.05pt;z-index:251669504;visibility:visible;mso-wrap-style:square;mso-wrap-distance-left:9pt;mso-wrap-distance-top:0;mso-wrap-distance-right:9pt;mso-wrap-distance-bottom:0;mso-position-horizontal:absolute;mso-position-horizontal-relative:text;mso-position-vertical:absolute;mso-position-vertical-relative:text;v-text-anchor:middle" o:gfxdata="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" filled="f" strokecolor="black [3213]" strokeweight="1pt"/>
+            </w:pict>
+          </mc:Fallback>
+        </mc:AlternateContent>
+      </w:r>
+      <w:r>
+        <w:rPr>
+          <w:rFonts w:ascii="Preeti" w:hAnsi="Preeti"/>
+          <w:noProof/>
+          <w:sz w:val="34"/>
+          <w:szCs w:val="34"/>
+          <w14:ligatures w14:val="standardContextual"/>
+        </w:rPr>
+        <mc:AlternateContent>
+          <mc:Choice Requires="wps">
+            <w:drawing>
+              <wp:anchor distT="0" distB="0" distL="114300" distR="114300" simplePos="0" relativeHeight="251667456" behindDoc="0" locked="0" layoutInCell="1" allowOverlap="1" wp14:anchorId="49E05602" wp14:editId="47415985">
+                <wp:simplePos x="0" y="0"/>
+                <wp:positionH relativeFrom="column">
+                  <wp:posOffset>2059940</wp:posOffset>
+                </wp:positionH>
+                <wp:positionV relativeFrom="paragraph">
+                  <wp:posOffset>4379</wp:posOffset>
+                </wp:positionV>
+                <wp:extent cx="967839" cy="267195"/>
+                <wp:effectExtent l="0" t="0" r="22860" b="19050"/>
+                <wp:wrapNone/>
+                <wp:docPr id="1448552590" name="Rectangle 7"/>
+                <wp:cNvGraphicFramePr/>
+                <a:graphic xmlns:a="http://schemas.openxmlformats.org/drawingml/2006/main">
+                  <a:graphicData uri="http://schemas.microsoft.com/office/word/2010/wordprocessingShape">
+                    <wps:wsp>
+                      <wps:cNvSpPr/>
+                      <wps:spPr>
+                        <a:xfrm>
+                          <a:off x="0" y="0"/>
+                          <a:ext cx="967839" cy="267195"/>
+                        </a:xfrm>
+                        <a:prstGeom prst="rect">
+                          <a:avLst/>
+                        </a:prstGeom>
+                        <a:noFill/>
+                        <a:ln>
+                          <a:solidFill>
+                            <a:schemeClr val="tx1"/>
+                          </a:solidFill>
+                        </a:ln>
+                        <a:effectLst/>
+                      </wps:spPr>
+                      <wps:style>
+                        <a:lnRef idx="2">
+                          <a:schemeClr val="accent1">
+                            <a:shade val="15000"/>
+                          </a:schemeClr>
+                        </a:lnRef>
+                        <a:fillRef idx="1">
+                          <a:schemeClr val="accent1"/>
+                        </a:fillRef>
+                        <a:effectRef idx="0">
+                          <a:schemeClr val="accent1"/>
+                        </a:effectRef>
+                        <a:fontRef idx="minor">
+                          <a:schemeClr val="lt1"/>
+                        </a:fontRef>
+                      </wps:style>
+                      <wps:bodyPr rot="0" spcFirstLastPara="0" vertOverflow="overflow" horzOverflow="overflow" vert="horz" wrap="square" lIns="91440" tIns="45720" rIns="91440" bIns="45720" numCol="1" spcCol="0" rtlCol="0" fromWordArt="0" anchor="ctr" anchorCtr="0" forceAA="0" compatLnSpc="1">
+                        <a:prstTxWarp prst="textNoShape">
+                          <a:avLst/>
+                        </a:prstTxWarp>
+                        <a:noAutofit/>
+                      </wps:bodyPr>
+                    </wps:wsp>
+                  </a:graphicData>
+                </a:graphic>
+              </wp:anchor>
+            </w:drawing>
+          </mc:Choice>
+          <mc:Fallback>
+            <w:pict>
+              <v:rect w14:anchorId="4E5CC92C" id="Rectangle 7" o:spid="_x0000_s1026" style="position:absolute;margin-left:162.2pt;margin-top:.35pt;width:76.2pt;height:21.05pt;z-index:251667456;visibility:visible;mso-wrap-style:square;mso-wrap-distance-left:9pt;mso-wrap-distance-top:0;mso-wrap-distance-right:9pt;mso-wrap-distance-bottom:0;mso-position-horizontal:absolute;mso-position-horizontal-relative:text;mso-position-vertical:absolute;mso-position-vertical-relative:text;v-text-anchor:middle" o:gfxdata="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" filled="f" strokecolor="black [3213]" strokeweight="1pt"/>
+            </w:pict>
+          </mc:Fallback>
+        </mc:AlternateContent>
+      </w:r>
+      <w:r>
+        <w:rPr>
+          <w:rFonts w:ascii="Preeti" w:hAnsi="Preeti"/>
+          <w:sz w:val="34"/>
+          <w:szCs w:val="34"/>
+        </w:rPr>
+        <w:t xml:space="preserve">s_ laNnL / l;NnL 1fgL lyP . </w:t>
+      </w:r>
+    </w:p>
+    <w:p>
+      <w:pPr>
+        <w:tabs>
+          <w:tab w:val="left" w:pos="1440"/>
+        </w:tabs>
+        <w:spacing w:after="0" w:line="360" w:lineRule="auto"/>
+        <w:jc w:val="both"/>
+        <w:rPr>
+          <w:rFonts w:ascii="Preeti" w:hAnsi="Preeti"/>
+          <w:sz w:val="34"/>
+          <w:szCs w:val="34"/>
+        </w:rPr>
+      </w:pPr>
+      <w:r>
+        <w:rPr>
+          <w:rFonts w:ascii="Preeti" w:hAnsi="Preeti"/>
+          <w:noProof/>
+          <w:sz w:val="34"/>
+          <w:szCs w:val="34"/>
+          <w14:ligatures w14:val="standardContextual"/>
+        </w:rPr>
+        <mc:AlternateContent>
+          <mc:Choice Requires="wps">
+            <w:drawing>
+              <wp:anchor distT="0" distB="0" distL="114300" distR="114300" simplePos="0" relativeHeight="251671552" behindDoc="0" locked="0" layoutInCell="1" allowOverlap="1" wp14:anchorId="300613DA" wp14:editId="7EA3C217">
+                <wp:simplePos x="0" y="0"/>
+                <wp:positionH relativeFrom="column">
+                  <wp:posOffset>1555667</wp:posOffset>
+                </wp:positionH>
+                <wp:positionV relativeFrom="paragraph">
+                  <wp:posOffset>324263</wp:posOffset>
+                </wp:positionV>
+                <wp:extent cx="967839" cy="267195"/>
+                <wp:effectExtent l="0" t="0" r="22860" b="19050"/>
+                <wp:wrapNone/>
+                <wp:docPr id="79638379" name="Rectangle 7"/>
+                <wp:cNvGraphicFramePr/>
+                <a:graphic xmlns:a="http://schemas.openxmlformats.org/drawingml/2006/main">
+                  <a:graphicData uri="http://schemas.microsoft.com/office/word/2010/wordprocessingShape">
+                    <wps:wsp>
+                      <wps:cNvSpPr/>
+                      <wps:spPr>
+                        <a:xfrm>
+                          <a:off x="0" y="0"/>
+                          <a:ext cx="967839" cy="267195"/>
+                        </a:xfrm>
+                        <a:prstGeom prst="rect">
+                          <a:avLst/>
+                        </a:prstGeom>
+                        <a:noFill/>
+                        <a:ln>
+                          <a:solidFill>
+                            <a:schemeClr val="tx1"/>
+                          </a:solidFill>
+                        </a:ln>
+                        <a:effectLst/>
+                      </wps:spPr>
+                      <wps:style>
+                        <a:lnRef idx="2">
+                          <a:schemeClr val="accent1">
+                            <a:shade val="15000"/>
+                          </a:schemeClr>
+                        </a:lnRef>
+                        <a:fillRef idx="1">
+                          <a:schemeClr val="accent1"/>
+                        </a:fillRef>
+                        <a:effectRef idx="0">
+                          <a:schemeClr val="accent1"/>
+                        </a:effectRef>
+                        <a:fontRef idx="minor">
+                          <a:schemeClr val="lt1"/>
+                        </a:fontRef>
+                      </wps:style>
+                      <wps:bodyPr rot="0" spcFirstLastPara="0" vertOverflow="overflow" horzOverflow="overflow" vert="horz" wrap="square" lIns="91440" tIns="45720" rIns="91440" bIns="45720" numCol="1" spcCol="0" rtlCol="0" fromWordArt="0" anchor="ctr" anchorCtr="0" forceAA="0" compatLnSpc="1">
+                        <a:prstTxWarp prst="textNoShape">
+                          <a:avLst/>
+                        </a:prstTxWarp>
+                        <a:noAutofit/>
+                      </wps:bodyPr>
+                    </wps:wsp>
+                  </a:graphicData>
+                </a:graphic>
+              </wp:anchor>
+            </w:drawing>
+          </mc:Choice>
+          <mc:Fallback>
+            <w:pict>
+              <v:rect w14:anchorId="07905CB0" id="Rectangle 7" o:spid="_x0000_s1026" style="position:absolute;margin-left:122.5pt;margin-top:25.55pt;width:76.2pt;height:21.05pt;z-index:251671552;visibility:visible;mso-wrap-style:square;mso-wrap-distance-left:9pt;mso-wrap-distance-top:0;mso-wrap-distance-right:9pt;mso-wrap-distance-bottom:0;mso-position-horizontal:absolute;mso-position-horizontal-relative:text;mso-position-vertical:absolute;mso-position-vertical-relative:text;v-text-anchor:middle" o:gfxdata="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" filled="f" strokecolor="black [3213]" strokeweight="1pt"/>
+            </w:pict>
+          </mc:Fallback>
+        </mc:AlternateContent>
+      </w:r>
+      <w:r>
+        <w:rPr>
+          <w:rFonts w:ascii="Preeti" w:hAnsi="Preeti"/>
+          <w:sz w:val="34"/>
+          <w:szCs w:val="34"/>
+        </w:rPr>
+        <w:t xml:space="preserve">v_ ufpFvfg] syf v]Nbf lgod rflxG5 . </w:t>
+      </w:r>
+    </w:p>
+    <w:p>
+      <w:pPr>
+        <w:tabs>
+          <w:tab w:val="left" w:pos="1440"/>
+        </w:tabs>
+        <w:spacing w:after="0" w:line="360" w:lineRule="auto"/>
+        <w:jc w:val="both"/>
+        <w:rPr>
+          <w:rFonts w:ascii="Preeti" w:hAnsi="Preeti"/>
+          <w:sz w:val="34"/>
+          <w:szCs w:val="34"/>
+        </w:rPr>
+      </w:pPr>
+      <w:r>
+        <w:rPr>
+          <w:rFonts w:ascii="Preeti" w:hAnsi="Preeti"/>
+          <w:noProof/>
+          <w:sz w:val="34"/>
+          <w:szCs w:val="34"/>
+          <w14:ligatures w14:val="standardContextual"/>
+        </w:rPr>
+        <mc:AlternateContent>
+          <mc:Choice Requires="wps">
+            <w:drawing>
+              <wp:anchor distT="0" distB="0" distL="114300" distR="114300" simplePos="0" relativeHeight="251673600" behindDoc="0" locked="0" layoutInCell="1" allowOverlap="1" wp14:anchorId="395C092B" wp14:editId="5A6B3D9E">
+                <wp:simplePos x="0" y="0"/>
+                <wp:positionH relativeFrom="column">
+                  <wp:posOffset>2179122</wp:posOffset>
+                </wp:positionH>
+                <wp:positionV relativeFrom="paragraph">
+                  <wp:posOffset>318960</wp:posOffset>
+                </wp:positionV>
+                <wp:extent cx="967839" cy="267195"/>
+                <wp:effectExtent l="0" t="0" r="22860" b="19050"/>
+                <wp:wrapNone/>
+                <wp:docPr id="255358628" name="Rectangle 7"/>
+                <wp:cNvGraphicFramePr/>
+                <a:graphic xmlns:a="http://schemas.openxmlformats.org/drawingml/2006/main">
+                  <a:graphicData uri="http://schemas.microsoft.com/office/word/2010/wordprocessingShape">
+                    <wps:wsp>
+                      <wps:cNvSpPr/>
+                      <wps:spPr>
+                        <a:xfrm>
+                          <a:off x="0" y="0"/>
+                          <a:ext cx="967839" cy="267195"/>
+                        </a:xfrm>
+                        <a:prstGeom prst="rect">
+                          <a:avLst/>
+                        </a:prstGeom>
+                        <a:noFill/>
+                        <a:ln>
+                          <a:solidFill>
+                            <a:schemeClr val="tx1"/>
+                          </a:solidFill>
+                        </a:ln>
+                        <a:effectLst/>
+                      </wps:spPr>
+                      <wps:style>
+                        <a:lnRef idx="2">
+                          <a:schemeClr val="accent1">
+                            <a:shade val="15000"/>
+                          </a:schemeClr>
+                        </a:lnRef>
+                        <a:fillRef idx="1">
+                          <a:schemeClr val="accent1"/>
+                        </a:fillRef>
+                        <a:effectRef idx="0">
+                          <a:schemeClr val="accent1"/>
+                        </a:effectRef>
+                        <a:fontRef idx="minor">
+                          <a:schemeClr val="lt1"/>
+                        </a:fontRef>
+                      </wps:style>
+                      <wps:bodyPr rot="0" spcFirstLastPara="0" vertOverflow="overflow" horzOverflow="overflow" vert="horz" wrap="square" lIns="91440" tIns="45720" rIns="91440" bIns="45720" numCol="1" spcCol="0" rtlCol="0" fromWordArt="0" anchor="ctr" anchorCtr="0" forceAA="0" compatLnSpc="1">
+                        <a:prstTxWarp prst="textNoShape">
+                          <a:avLst/>
+                        </a:prstTxWarp>
+                        <a:noAutofit/>
+                      </wps:bodyPr>
+                    </wps:wsp>
+                  </a:graphicData>
+                </a:graphic>
+              </wp:anchor>
+            </w:drawing>
+          </mc:Choice>
+          <mc:Fallback>
+            <w:pict>
+              <v:rect w14:anchorId="5120F519" id="Rectangle 7" o:spid="_x0000_s1026" style="position:absolute;margin-left:171.6pt;margin-top:25.1pt;width:76.2pt;height:21.05pt;z-index:251673600;visibility:visible;mso-wrap-style:square;mso-wrap-distance-left:9pt;mso-wrap-distance-top:0;mso-wrap-distance-right:9pt;mso-wrap-distance-bottom:0;mso-position-horizontal:absolute;mso-position-horizontal-relative:text;mso-position-vertical:absolute;mso-position-vertical-relative:text;v-text-anchor:middle" o:gfxdata="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" filled="f" strokecolor="black [3213]" strokeweight="1pt"/>
+            </w:pict>
+          </mc:Fallback>
+        </mc:AlternateContent>
+      </w:r>
+      <w:r>
+        <w:rPr>
+          <w:rFonts w:ascii="Preeti" w:hAnsi="Preeti"/>
+          <w:sz w:val="34"/>
+          <w:szCs w:val="34"/>
+        </w:rPr>
+        <w:t>u_ k/]jfn] 3fF; vfG</w:t>
+      </w:r>
+      <w:r>
+        <w:rPr>
+          <w:rFonts w:ascii="Preeti" w:hAnsi="Preeti"/>
+          <w:sz w:val="34"/>
+          <w:szCs w:val="34"/>
+        </w:rPr>
+        <w:t>g</w:t>
+      </w:r>
+      <w:r>
+        <w:rPr>
+          <w:rFonts w:ascii="Preeti" w:hAnsi="Preeti"/>
+          <w:sz w:val="34"/>
+          <w:szCs w:val="34"/>
+        </w:rPr>
+        <w:t xml:space="preserve"> . </w:t>
+      </w:r>
+    </w:p>
+    <w:p>
+      <w:pPr>
+        <w:tabs>
+          <w:tab w:val="left" w:pos="1440"/>
+        </w:tabs>
+        <w:spacing w:after="0" w:line="360" w:lineRule="auto"/>
+        <w:jc w:val="both"/>
+        <w:rPr>
+          <w:rFonts w:ascii="Preeti" w:hAnsi="Preeti"/>
+          <w:sz w:val="34"/>
+          <w:szCs w:val="34"/>
+        </w:rPr>
+      </w:pPr>
+      <w:r>
+        <w:rPr>
+          <w:rFonts w:ascii="Preeti" w:hAnsi="Preeti"/>
+          <w:noProof/>
+          <w:sz w:val="34"/>
+          <w:szCs w:val="34"/>
+          <w14:ligatures w14:val="standardContextual"/>
+        </w:rPr>
+        <mc:AlternateContent>
+          <mc:Choice Requires="wps">
+            <w:drawing>
+              <wp:anchor distT="0" distB="0" distL="114300" distR="114300" simplePos="0" relativeHeight="251675648" behindDoc="0" locked="0" layoutInCell="1" allowOverlap="1" wp14:anchorId="4BAFFA59" wp14:editId="18830496">
+                <wp:simplePos x="0" y="0"/>
+                <wp:positionH relativeFrom="column">
+                  <wp:posOffset>1514104</wp:posOffset>
+                </wp:positionH>
+                <wp:positionV relativeFrom="paragraph">
+                  <wp:posOffset>330835</wp:posOffset>
+                </wp:positionV>
+                <wp:extent cx="967839" cy="267195"/>
+                <wp:effectExtent l="0" t="0" r="22860" b="19050"/>
+                <wp:wrapNone/>
+                <wp:docPr id="1984931330" name="Rectangle 7"/>
+                <wp:cNvGraphicFramePr/>
+                <a:graphic xmlns:a="http://schemas.openxmlformats.org/drawingml/2006/main">
+                  <a:graphicData uri="http://schemas.microsoft.com/office/word/2010/wordprocessingShape">
+                    <wps:wsp>
+                      <wps:cNvSpPr/>
+                      <wps:spPr>
+                        <a:xfrm>
+                          <a:off x="0" y="0"/>
+                          <a:ext cx="967839" cy="267195"/>
+                        </a:xfrm>
+                        <a:prstGeom prst="rect">
+                          <a:avLst/>
+                        </a:prstGeom>
+                        <a:noFill/>
+                        <a:ln>
+                          <a:solidFill>
+                            <a:schemeClr val="tx1"/>
+                          </a:solidFill>
+                        </a:ln>
+                        <a:effectLst/>
+                      </wps:spPr>
+                      <wps:style>
+                        <a:lnRef idx="2">
+                          <a:schemeClr val="accent1">
+                            <a:shade val="15000"/>
+                          </a:schemeClr>
+                        </a:lnRef>
+                        <a:fillRef idx="1">
+                          <a:schemeClr val="accent1"/>
+                        </a:fillRef>
+                        <a:effectRef idx="0">
+                          <a:schemeClr val="accent1"/>
+                        </a:effectRef>
+                        <a:fontRef idx="minor">
+                          <a:schemeClr val="lt1"/>
+                        </a:fontRef>
+                      </wps:style>
+                      <wps:bodyPr rot="0" spcFirstLastPara="0" vertOverflow="overflow" horzOverflow="overflow" vert="horz" wrap="square" lIns="91440" tIns="45720" rIns="91440" bIns="45720" numCol="1" spcCol="0" rtlCol="0" fromWordArt="0" anchor="ctr" anchorCtr="0" forceAA="0" compatLnSpc="1">
+                        <a:prstTxWarp prst="textNoShape">
+                          <a:avLst/>
+                        </a:prstTxWarp>
+                        <a:noAutofit/>
+                      </wps:bodyPr>
+                    </wps:wsp>
+                  </a:graphicData>
+                </a:graphic>
+              </wp:anchor>
+            </w:drawing>
+          </mc:Choice>
+          <mc:Fallback>
+            <w:pict>
+              <v:rect w14:anchorId="223BE5B1" id="Rectangle 7" o:spid="_x0000_s1026" style="position:absolute;margin-left:119.2pt;margin-top:26.05pt;width:76.2pt;height:21.05pt;z-index:251675648;visibility:visible;mso-wrap-style:square;mso-wrap-distance-left:9pt;mso-wrap-distance-top:0;mso-wrap-distance-right:9pt;mso-wrap-distance-bottom:0;mso-position-horizontal:absolute;mso-position-horizontal-relative:text;mso-position-vertical:absolute;mso-position-vertical-relative:text;v-text-anchor:middle" o:gfxdata="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" filled="f" strokecolor="black [3213]" strokeweight="1pt"/>
+            </w:pict>
+          </mc:Fallback>
+        </mc:AlternateContent>
+      </w:r>
+      <w:r>
+        <w:rPr>
+          <w:rFonts w:ascii="Preeti" w:hAnsi="Preeti"/>
+          <w:sz w:val="34"/>
+          <w:szCs w:val="34"/>
+        </w:rPr>
+        <w:t xml:space="preserve">3_ Ps dlxgfdf tL; lbg x'G5 . </w:t>
+      </w:r>
+    </w:p>
+    <w:p>
+      <w:pPr>
+        <w:tabs>
+          <w:tab w:val="left" w:pos="1440"/>
+        </w:tabs>
+        <w:spacing w:after="0" w:line="360" w:lineRule="auto"/>
+        <w:jc w:val="both"/>
+        <w:rPr>
+          <w:rFonts w:ascii="Preeti" w:hAnsi="Preeti"/>
+          <w:sz w:val="34"/>
+          <w:szCs w:val="34"/>
+        </w:rPr>
+      </w:pPr>
+      <w:r>
+        <w:rPr>
+          <w:rFonts w:ascii="Preeti" w:hAnsi="Preeti"/>
+          <w:sz w:val="34"/>
+          <w:szCs w:val="34"/>
+        </w:rPr>
+        <w:t xml:space="preserve">ª_ lj3f ;DklQ /x]5 . </w:t>
       </w:r>
     </w:p>
     <w:p>
@@ -2921,29 +2466,7 @@
           <w:szCs w:val="34"/>
         </w:rPr>
         <w:lastRenderedPageBreak/>
-        <w:t>$_ gofF zAb agfpg'xf</w:t>
-      </w:r>
-      <w:proofErr w:type="gramStart"/>
-      <w:r>
-        <w:rPr>
-          <w:rFonts w:ascii="Preeti" w:hAnsi="Preeti"/>
-          <w:b/>
-          <w:bCs/>
-          <w:sz w:val="34"/>
-          <w:szCs w:val="34"/>
-        </w:rPr>
-        <w:t>];\</w:t>
-      </w:r>
-      <w:proofErr w:type="gramEnd"/>
-      <w:r>
-        <w:rPr>
-          <w:rFonts w:ascii="Preeti" w:hAnsi="Preeti"/>
-          <w:b/>
-          <w:bCs/>
-          <w:sz w:val="34"/>
-          <w:szCs w:val="34"/>
-        </w:rPr>
-        <w:t xml:space="preserve"> .</w:t>
+        <w:t>$_ gofF zAb agfpg'xf];\ .</w:t>
       </w:r>
       <w:r>
         <w:rPr>
@@ -3265,25 +2788,7 @@
           <w:szCs w:val="34"/>
         </w:rPr>
         <w:tab/>
-        <w:t>ljrf</w:t>
-      </w:r>
-      <w:proofErr w:type="gramStart"/>
-      <w:r>
-        <w:rPr>
-          <w:rFonts w:ascii="Preeti" w:hAnsi="Preeti"/>
-          <w:sz w:val="34"/>
-          <w:szCs w:val="34"/>
-        </w:rPr>
-        <w:t>/  =</w:t>
-      </w:r>
-      <w:proofErr w:type="gramEnd"/>
-      <w:r>
-        <w:rPr>
-          <w:rFonts w:ascii="Preeti" w:hAnsi="Preeti"/>
-          <w:sz w:val="34"/>
-          <w:szCs w:val="34"/>
-        </w:rPr>
-        <w:t>========================</w:t>
+        <w:t>ljrf/  =========================</w:t>
       </w:r>
     </w:p>
     <w:p>
@@ -3550,14 +3055,6 @@
           <w:szCs w:val="34"/>
         </w:rPr>
         <w:tab/>
-      </w:r>
-      <w:proofErr w:type="gramStart"/>
-      <w:r>
-        <w:rPr>
-          <w:rFonts w:ascii="Preeti" w:hAnsi="Preeti"/>
-          <w:sz w:val="34"/>
-          <w:szCs w:val="34"/>
-        </w:rPr>
         <w:t xml:space="preserve">sd{ </w:t>
       </w:r>
       <w:r>
@@ -3567,14 +3064,6 @@
           <w:szCs w:val="34"/>
         </w:rPr>
         <w:tab/>
-      </w:r>
-      <w:proofErr w:type="gramEnd"/>
-      <w:r>
-        <w:rPr>
-          <w:rFonts w:ascii="Preeti" w:hAnsi="Preeti"/>
-          <w:sz w:val="34"/>
-          <w:szCs w:val="34"/>
-        </w:rPr>
         <w:t>============================</w:t>
       </w:r>
     </w:p>
@@ -3601,51 +3090,7 @@
           <w:sz w:val="34"/>
           <w:szCs w:val="34"/>
         </w:rPr>
-        <w:t xml:space="preserve">%_ gldNg] zAbdf uf]nf] </w:t>
-      </w:r>
-      <w:proofErr w:type="gramStart"/>
-      <w:r>
-        <w:rPr>
-          <w:rFonts w:ascii="Preeti" w:hAnsi="Preeti"/>
-          <w:b/>
-          <w:bCs/>
-          <w:sz w:val="34"/>
-          <w:szCs w:val="34"/>
-        </w:rPr>
-        <w:t>-)_</w:t>
-      </w:r>
-      <w:proofErr w:type="gramEnd"/>
-      <w:r>
-        <w:rPr>
-          <w:rFonts w:ascii="Preeti" w:hAnsi="Preeti"/>
-          <w:b/>
-          <w:bCs/>
-          <w:sz w:val="34"/>
-          <w:szCs w:val="34"/>
-        </w:rPr>
-        <w:t xml:space="preserve"> 3]/f nufpg'xf</w:t>
-      </w:r>
-      <w:proofErr w:type="gramStart"/>
-      <w:r>
-        <w:rPr>
-          <w:rFonts w:ascii="Preeti" w:hAnsi="Preeti"/>
-          <w:b/>
-          <w:bCs/>
-          <w:sz w:val="34"/>
-          <w:szCs w:val="34"/>
-        </w:rPr>
-        <w:t>];\</w:t>
-      </w:r>
-      <w:proofErr w:type="gramEnd"/>
-      <w:r>
-        <w:rPr>
-          <w:rFonts w:ascii="Preeti" w:hAnsi="Preeti"/>
-          <w:b/>
-          <w:bCs/>
-          <w:sz w:val="34"/>
-          <w:szCs w:val="34"/>
-        </w:rPr>
-        <w:t xml:space="preserve"> .</w:t>
+        <w:t>%_ gldNg] zAbdf uf]nf] -)_ 3]/f nufpg'xf];\ .</w:t>
       </w:r>
       <w:r>
         <w:rPr>
@@ -3824,7 +3269,7 @@
           <w:szCs w:val="34"/>
         </w:rPr>
         <w:tab/>
-        <w:t xml:space="preserve">kz' </w:t>
+        <w:t>kz'</w:t>
       </w:r>
     </w:p>
     <w:p>
@@ -3913,7 +3358,7 @@
           <w:szCs w:val="34"/>
         </w:rPr>
         <w:tab/>
-        <w:t xml:space="preserve">vfFb} </w:t>
+        <w:t>vfFb}</w:t>
       </w:r>
     </w:p>
     <w:p>
@@ -3986,47 +3431,36 @@
           <w:szCs w:val="34"/>
         </w:rPr>
         <w:tab/>
-        <w:t xml:space="preserve">vfFb} </w:t>
-      </w:r>
-    </w:p>
-    <w:p>
-      <w:pPr>
-        <w:tabs>
-          <w:tab w:val="left" w:pos="1440"/>
-        </w:tabs>
-        <w:spacing w:after="0" w:line="360" w:lineRule="auto"/>
-        <w:jc w:val="both"/>
-        <w:rPr>
-          <w:rFonts w:ascii="Preeti" w:hAnsi="Preeti"/>
-          <w:sz w:val="34"/>
-          <w:szCs w:val="34"/>
-        </w:rPr>
-      </w:pPr>
-      <w:r>
-        <w:rPr>
-          <w:rFonts w:ascii="Preeti" w:hAnsi="Preeti"/>
-          <w:sz w:val="34"/>
-          <w:szCs w:val="34"/>
-        </w:rPr>
-        <w:t>t</w:t>
-      </w:r>
-      <w:proofErr w:type="gramStart"/>
-      <w:r>
-        <w:rPr>
-          <w:rFonts w:ascii="Preeti" w:hAnsi="Preeti"/>
-          <w:sz w:val="34"/>
-          <w:szCs w:val="34"/>
-        </w:rPr>
-        <w:t>'?Gt</w:t>
-      </w:r>
-      <w:proofErr w:type="gramEnd"/>
-      <w:r>
-        <w:rPr>
-          <w:rFonts w:ascii="Preeti" w:hAnsi="Preeti"/>
-          <w:sz w:val="34"/>
-          <w:szCs w:val="34"/>
-        </w:rPr>
-        <w:t xml:space="preserve"> M </w:t>
+      </w:r>
+      <w:r>
+        <w:rPr>
+          <w:rFonts w:ascii="Preeti" w:hAnsi="Preeti"/>
+          <w:sz w:val="34"/>
+          <w:szCs w:val="34"/>
+        </w:rPr>
+        <w:t>r'na'n]</w:t>
+      </w:r>
+    </w:p>
+    <w:p>
+      <w:pPr>
+        <w:tabs>
+          <w:tab w:val="left" w:pos="1440"/>
+        </w:tabs>
+        <w:spacing w:after="0" w:line="360" w:lineRule="auto"/>
+        <w:jc w:val="both"/>
+        <w:rPr>
+          <w:rFonts w:ascii="Preeti" w:hAnsi="Preeti"/>
+          <w:sz w:val="34"/>
+          <w:szCs w:val="34"/>
+        </w:rPr>
+      </w:pPr>
+      <w:r>
+        <w:rPr>
+          <w:rFonts w:ascii="Preeti" w:hAnsi="Preeti"/>
+          <w:sz w:val="34"/>
+          <w:szCs w:val="34"/>
+        </w:rPr>
+        <w:t xml:space="preserve">t'?Gt M </w:t>
       </w:r>
       <w:r>
         <w:rPr>
@@ -4068,6 +3502,21 @@
           <w:szCs w:val="34"/>
         </w:rPr>
         <w:tab/>
+      </w:r>
+      <w:r>
+        <w:rPr>
+          <w:rFonts w:ascii="Preeti" w:hAnsi="Preeti"/>
+          <w:sz w:val="34"/>
+          <w:szCs w:val="34"/>
+        </w:rPr>
+        <w:t xml:space="preserve"> </w:t>
+      </w:r>
+      <w:r>
+        <w:rPr>
+          <w:rFonts w:ascii="Preeti" w:hAnsi="Preeti"/>
+          <w:sz w:val="34"/>
+          <w:szCs w:val="34"/>
+        </w:rPr>
         <w:t xml:space="preserve">l56f] </w:t>
       </w:r>
       <w:r>
@@ -4093,55 +3542,33 @@
           <w:szCs w:val="34"/>
         </w:rPr>
         <w:tab/>
-        <w:t xml:space="preserve">rfF8} </w:t>
-      </w:r>
-    </w:p>
-    <w:p>
-      <w:pPr>
-        <w:tabs>
-          <w:tab w:val="left" w:pos="1440"/>
-        </w:tabs>
-        <w:spacing w:after="0" w:line="360" w:lineRule="auto"/>
-        <w:jc w:val="both"/>
-        <w:rPr>
-          <w:rFonts w:ascii="Preeti" w:hAnsi="Preeti"/>
-          <w:b/>
-          <w:bCs/>
-          <w:sz w:val="34"/>
-          <w:szCs w:val="34"/>
-        </w:rPr>
-      </w:pPr>
-      <w:r>
-        <w:rPr>
-          <w:rFonts w:ascii="Preeti" w:hAnsi="Preeti"/>
-          <w:b/>
-          <w:bCs/>
-          <w:sz w:val="34"/>
-          <w:szCs w:val="34"/>
-        </w:rPr>
-        <w:t>^_ vfnL 7fpFdf pko'Qm zAb eg'{xf</w:t>
-      </w:r>
-      <w:proofErr w:type="gramStart"/>
-      <w:r>
-        <w:rPr>
-          <w:rFonts w:ascii="Preeti" w:hAnsi="Preeti"/>
-          <w:b/>
-          <w:bCs/>
-          <w:sz w:val="34"/>
-          <w:szCs w:val="34"/>
-        </w:rPr>
-        <w:t>];\</w:t>
-      </w:r>
-      <w:proofErr w:type="gramEnd"/>
-      <w:r>
-        <w:rPr>
-          <w:rFonts w:ascii="Preeti" w:hAnsi="Preeti"/>
-          <w:b/>
-          <w:bCs/>
-          <w:sz w:val="34"/>
-          <w:szCs w:val="34"/>
-        </w:rPr>
-        <w:t xml:space="preserve"> .</w:t>
+        <w:t>rfF8}</w:t>
+      </w:r>
+    </w:p>
+    <w:p>
+      <w:pPr>
+        <w:tabs>
+          <w:tab w:val="left" w:pos="1440"/>
+        </w:tabs>
+        <w:spacing w:after="0" w:line="360" w:lineRule="auto"/>
+        <w:jc w:val="both"/>
+        <w:rPr>
+          <w:rFonts w:ascii="Preeti" w:hAnsi="Preeti"/>
+          <w:b/>
+          <w:bCs/>
+          <w:sz w:val="34"/>
+          <w:szCs w:val="34"/>
+        </w:rPr>
+      </w:pPr>
+      <w:r>
+        <w:rPr>
+          <w:rFonts w:ascii="Preeti" w:hAnsi="Preeti"/>
+          <w:b/>
+          <w:bCs/>
+          <w:sz w:val="34"/>
+          <w:szCs w:val="34"/>
+        </w:rPr>
+        <w:t>^_ vfnL 7fpFdf pko'Qm zAb eg'{xf];\ .</w:t>
       </w:r>
       <w:r>
         <w:rPr>
@@ -4267,335 +3694,355 @@
           <w:sz w:val="34"/>
           <w:szCs w:val="34"/>
         </w:rPr>
-        <w:t xml:space="preserve">-cldnf], an, oGq, u'F8, </w:t>
-      </w:r>
-      <w:proofErr w:type="gramStart"/>
-      <w:r>
-        <w:rPr>
-          <w:rFonts w:ascii="Preeti" w:hAnsi="Preeti"/>
-          <w:b/>
-          <w:bCs/>
-          <w:sz w:val="34"/>
-          <w:szCs w:val="34"/>
-        </w:rPr>
-        <w:t>jiff{</w:t>
-      </w:r>
-      <w:proofErr w:type="gramEnd"/>
-      <w:r>
-        <w:rPr>
-          <w:rFonts w:ascii="Preeti" w:hAnsi="Preeti"/>
-          <w:b/>
-          <w:bCs/>
-          <w:sz w:val="34"/>
-          <w:szCs w:val="34"/>
-        </w:rPr>
-        <w:t xml:space="preserve">_ </w:t>
-      </w:r>
-    </w:p>
-    <w:p>
-      <w:pPr>
-        <w:tabs>
-          <w:tab w:val="left" w:pos="1440"/>
-        </w:tabs>
-        <w:spacing w:after="0" w:line="360" w:lineRule="auto"/>
-        <w:jc w:val="both"/>
-        <w:rPr>
-          <w:rFonts w:ascii="Preeti" w:hAnsi="Preeti"/>
-          <w:sz w:val="34"/>
-          <w:szCs w:val="34"/>
-        </w:rPr>
-      </w:pPr>
-      <w:r>
-        <w:rPr>
-          <w:rFonts w:ascii="Preeti" w:hAnsi="Preeti"/>
-          <w:sz w:val="34"/>
-          <w:szCs w:val="34"/>
-        </w:rPr>
-        <w:t>s_ es'G8</w:t>
-      </w:r>
-      <w:proofErr w:type="gramStart"/>
-      <w:r>
-        <w:rPr>
-          <w:rFonts w:ascii="Preeti" w:hAnsi="Preeti"/>
-          <w:sz w:val="34"/>
-          <w:szCs w:val="34"/>
-        </w:rPr>
-        <w:t>f]nfO{ =</w:t>
-      </w:r>
-      <w:proofErr w:type="gramEnd"/>
-      <w:r>
-        <w:rPr>
-          <w:rFonts w:ascii="Preeti" w:hAnsi="Preeti"/>
-          <w:sz w:val="34"/>
-          <w:szCs w:val="34"/>
-        </w:rPr>
-        <w:t>=======================klg elgG</w:t>
-      </w:r>
-      <w:proofErr w:type="gramStart"/>
-      <w:r>
-        <w:rPr>
-          <w:rFonts w:ascii="Preeti" w:hAnsi="Preeti"/>
-          <w:sz w:val="34"/>
-          <w:szCs w:val="34"/>
-        </w:rPr>
-        <w:t>5 .</w:t>
-      </w:r>
-      <w:proofErr w:type="gramEnd"/>
-      <w:r>
-        <w:rPr>
-          <w:rFonts w:ascii="Preeti" w:hAnsi="Preeti"/>
-          <w:sz w:val="34"/>
-          <w:szCs w:val="34"/>
-        </w:rPr>
-        <w:t xml:space="preserve"> </w:t>
-      </w:r>
-    </w:p>
-    <w:p>
-      <w:pPr>
-        <w:tabs>
-          <w:tab w:val="left" w:pos="1440"/>
-        </w:tabs>
-        <w:spacing w:after="0" w:line="360" w:lineRule="auto"/>
-        <w:jc w:val="both"/>
-        <w:rPr>
-          <w:rFonts w:ascii="Preeti" w:hAnsi="Preeti"/>
-          <w:sz w:val="34"/>
-          <w:szCs w:val="34"/>
-        </w:rPr>
-      </w:pPr>
-      <w:r>
-        <w:rPr>
-          <w:rFonts w:ascii="Preeti" w:hAnsi="Preeti"/>
-          <w:sz w:val="34"/>
-          <w:szCs w:val="34"/>
-        </w:rPr>
-        <w:t>v_ Nofk6k Ps k|sf/sf] ===================xf</w:t>
-      </w:r>
-      <w:proofErr w:type="gramStart"/>
-      <w:r>
-        <w:rPr>
-          <w:rFonts w:ascii="Preeti" w:hAnsi="Preeti"/>
-          <w:sz w:val="34"/>
-          <w:szCs w:val="34"/>
-        </w:rPr>
-        <w:t>] .</w:t>
-      </w:r>
-      <w:proofErr w:type="gramEnd"/>
-      <w:r>
-        <w:rPr>
-          <w:rFonts w:ascii="Preeti" w:hAnsi="Preeti"/>
-          <w:sz w:val="34"/>
-          <w:szCs w:val="34"/>
-        </w:rPr>
-        <w:t xml:space="preserve"> </w:t>
-      </w:r>
-    </w:p>
-    <w:p>
-      <w:pPr>
-        <w:tabs>
-          <w:tab w:val="left" w:pos="1440"/>
-        </w:tabs>
-        <w:spacing w:after="0" w:line="360" w:lineRule="auto"/>
-        <w:jc w:val="both"/>
-        <w:rPr>
-          <w:rFonts w:ascii="Preeti" w:hAnsi="Preeti"/>
-          <w:sz w:val="34"/>
-          <w:szCs w:val="34"/>
-        </w:rPr>
-      </w:pPr>
-      <w:r>
-        <w:rPr>
-          <w:rFonts w:ascii="Preeti" w:hAnsi="Preeti"/>
-          <w:sz w:val="34"/>
-          <w:szCs w:val="34"/>
-        </w:rPr>
-        <w:t>u_ k</w:t>
-      </w:r>
-      <w:proofErr w:type="gramStart"/>
-      <w:r>
-        <w:rPr>
-          <w:rFonts w:ascii="Preeti" w:hAnsi="Preeti"/>
-          <w:sz w:val="34"/>
-          <w:szCs w:val="34"/>
-        </w:rPr>
-        <w:t>/]jf</w:t>
-      </w:r>
-      <w:proofErr w:type="gramEnd"/>
-      <w:r>
-        <w:rPr>
-          <w:rFonts w:ascii="Preeti" w:hAnsi="Preeti"/>
-          <w:sz w:val="34"/>
-          <w:szCs w:val="34"/>
-        </w:rPr>
-        <w:t xml:space="preserve"> ==========================agfP/ a:</w:t>
-      </w:r>
-      <w:proofErr w:type="gramStart"/>
-      <w:r>
-        <w:rPr>
-          <w:rFonts w:ascii="Preeti" w:hAnsi="Preeti"/>
-          <w:sz w:val="34"/>
-          <w:szCs w:val="34"/>
-        </w:rPr>
-        <w:t>5 .</w:t>
-      </w:r>
-      <w:proofErr w:type="gramEnd"/>
-      <w:r>
-        <w:rPr>
-          <w:rFonts w:ascii="Preeti" w:hAnsi="Preeti"/>
-          <w:sz w:val="34"/>
-          <w:szCs w:val="34"/>
-        </w:rPr>
-        <w:t xml:space="preserve"> </w:t>
-      </w:r>
-    </w:p>
-    <w:p>
-      <w:pPr>
-        <w:tabs>
-          <w:tab w:val="left" w:pos="1440"/>
-        </w:tabs>
-        <w:spacing w:after="0" w:line="360" w:lineRule="auto"/>
-        <w:jc w:val="both"/>
-        <w:rPr>
-          <w:rFonts w:ascii="Preeti" w:hAnsi="Preeti"/>
-          <w:sz w:val="34"/>
-          <w:szCs w:val="34"/>
-        </w:rPr>
-      </w:pPr>
-      <w:r>
-        <w:rPr>
-          <w:rFonts w:ascii="Preeti" w:hAnsi="Preeti"/>
-          <w:sz w:val="34"/>
-          <w:szCs w:val="34"/>
-        </w:rPr>
-        <w:t>3_ sfutL =========================x'G</w:t>
-      </w:r>
-      <w:proofErr w:type="gramStart"/>
-      <w:r>
-        <w:rPr>
-          <w:rFonts w:ascii="Preeti" w:hAnsi="Preeti"/>
-          <w:sz w:val="34"/>
-          <w:szCs w:val="34"/>
-        </w:rPr>
-        <w:t>5 .</w:t>
-      </w:r>
-      <w:proofErr w:type="gramEnd"/>
-      <w:r>
-        <w:rPr>
-          <w:rFonts w:ascii="Preeti" w:hAnsi="Preeti"/>
-          <w:sz w:val="34"/>
-          <w:szCs w:val="34"/>
-        </w:rPr>
-        <w:t xml:space="preserve"> </w:t>
-      </w:r>
-    </w:p>
-    <w:p>
-      <w:pPr>
-        <w:tabs>
-          <w:tab w:val="left" w:pos="1440"/>
-        </w:tabs>
-        <w:spacing w:after="0" w:line="360" w:lineRule="auto"/>
-        <w:jc w:val="both"/>
-        <w:rPr>
-          <w:rFonts w:ascii="Preeti" w:hAnsi="Preeti"/>
-          <w:sz w:val="34"/>
-          <w:szCs w:val="34"/>
-        </w:rPr>
-      </w:pPr>
-      <w:r>
-        <w:rPr>
-          <w:rFonts w:ascii="Preeti" w:hAnsi="Preeti"/>
-          <w:sz w:val="34"/>
-          <w:szCs w:val="34"/>
-        </w:rPr>
-        <w:t>ª_ kfgL kfgL x'g] Ct' ===================xf</w:t>
-      </w:r>
-      <w:proofErr w:type="gramStart"/>
-      <w:r>
-        <w:rPr>
-          <w:rFonts w:ascii="Preeti" w:hAnsi="Preeti"/>
-          <w:sz w:val="34"/>
-          <w:szCs w:val="34"/>
-        </w:rPr>
-        <w:t>] .</w:t>
-      </w:r>
-      <w:proofErr w:type="gramEnd"/>
-      <w:r>
-        <w:rPr>
-          <w:rFonts w:ascii="Preeti" w:hAnsi="Preeti"/>
-          <w:sz w:val="34"/>
-          <w:szCs w:val="34"/>
-        </w:rPr>
-        <w:t xml:space="preserve"> </w:t>
-      </w:r>
-    </w:p>
-    <w:p>
-      <w:pPr>
-        <w:tabs>
-          <w:tab w:val="left" w:pos="1440"/>
-        </w:tabs>
-        <w:spacing w:after="0" w:line="360" w:lineRule="auto"/>
-        <w:jc w:val="both"/>
-        <w:rPr>
-          <w:rFonts w:ascii="Preeti" w:hAnsi="Preeti"/>
-          <w:b/>
-          <w:bCs/>
-          <w:sz w:val="34"/>
-          <w:szCs w:val="34"/>
-        </w:rPr>
-      </w:pPr>
-      <w:r>
-        <w:rPr>
-          <w:rFonts w:ascii="Preeti" w:hAnsi="Preeti"/>
-          <w:b/>
-          <w:bCs/>
-          <w:sz w:val="34"/>
-          <w:szCs w:val="34"/>
-        </w:rPr>
-        <w:t xml:space="preserve">&amp;_ pN6f] </w:t>
-      </w:r>
-      <w:proofErr w:type="gramStart"/>
-      <w:r>
-        <w:rPr>
-          <w:rFonts w:ascii="Preeti" w:hAnsi="Preeti"/>
-          <w:b/>
-          <w:bCs/>
-          <w:sz w:val="34"/>
-          <w:szCs w:val="34"/>
-        </w:rPr>
-        <w:t>cy{ lbg</w:t>
-      </w:r>
-      <w:proofErr w:type="gramEnd"/>
-      <w:r>
-        <w:rPr>
-          <w:rFonts w:ascii="Preeti" w:hAnsi="Preeti"/>
-          <w:b/>
-          <w:bCs/>
-          <w:sz w:val="34"/>
-          <w:szCs w:val="34"/>
-        </w:rPr>
-        <w:t xml:space="preserve">] zAb </w:t>
-      </w:r>
-      <w:proofErr w:type="gramStart"/>
-      <w:r>
-        <w:rPr>
-          <w:rFonts w:ascii="Preeti" w:hAnsi="Preeti"/>
-          <w:b/>
-          <w:bCs/>
-          <w:sz w:val="34"/>
-          <w:szCs w:val="34"/>
-        </w:rPr>
-        <w:t>n]Vg'xf];\</w:t>
-      </w:r>
-      <w:proofErr w:type="gramEnd"/>
-      <w:r>
-        <w:rPr>
-          <w:rFonts w:ascii="Preeti" w:hAnsi="Preeti"/>
-          <w:b/>
-          <w:bCs/>
-          <w:sz w:val="34"/>
-          <w:szCs w:val="34"/>
-        </w:rPr>
-        <w:t xml:space="preserve"> .</w:t>
+        <w:t xml:space="preserve">-cldnf], an, oGq, u'F8, jiff{_ </w:t>
+      </w:r>
+    </w:p>
+    <w:p>
+      <w:pPr>
+        <w:tabs>
+          <w:tab w:val="left" w:pos="1440"/>
+        </w:tabs>
+        <w:spacing w:after="0" w:line="360" w:lineRule="auto"/>
+        <w:jc w:val="both"/>
+        <w:rPr>
+          <w:rFonts w:ascii="Preeti" w:hAnsi="Preeti"/>
+          <w:sz w:val="34"/>
+          <w:szCs w:val="34"/>
+        </w:rPr>
+      </w:pPr>
+      <w:r>
+        <w:rPr>
+          <w:rFonts w:ascii="Preeti" w:hAnsi="Preeti"/>
+          <w:sz w:val="34"/>
+          <w:szCs w:val="34"/>
+        </w:rPr>
+        <w:t xml:space="preserve">s_ es'G8f]nfO{ ========================klg elgG5 . </w:t>
+      </w:r>
+    </w:p>
+    <w:p>
+      <w:pPr>
+        <w:tabs>
+          <w:tab w:val="left" w:pos="1440"/>
+        </w:tabs>
+        <w:spacing w:after="0" w:line="360" w:lineRule="auto"/>
+        <w:jc w:val="both"/>
+        <w:rPr>
+          <w:rFonts w:ascii="Preeti" w:hAnsi="Preeti"/>
+          <w:sz w:val="34"/>
+          <w:szCs w:val="34"/>
+        </w:rPr>
+      </w:pPr>
+      <w:r>
+        <w:rPr>
+          <w:rFonts w:ascii="Preeti" w:hAnsi="Preeti"/>
+          <w:sz w:val="34"/>
+          <w:szCs w:val="34"/>
+        </w:rPr>
+        <w:t xml:space="preserve">v_ Nofk6k Ps k|sf/sf] ===================xf] . </w:t>
+      </w:r>
+    </w:p>
+    <w:p>
+      <w:pPr>
+        <w:tabs>
+          <w:tab w:val="left" w:pos="1440"/>
+        </w:tabs>
+        <w:spacing w:after="0" w:line="360" w:lineRule="auto"/>
+        <w:jc w:val="both"/>
+        <w:rPr>
+          <w:rFonts w:ascii="Preeti" w:hAnsi="Preeti"/>
+          <w:sz w:val="34"/>
+          <w:szCs w:val="34"/>
+        </w:rPr>
+      </w:pPr>
+      <w:r>
+        <w:rPr>
+          <w:rFonts w:ascii="Preeti" w:hAnsi="Preeti"/>
+          <w:sz w:val="34"/>
+          <w:szCs w:val="34"/>
+        </w:rPr>
+        <w:t xml:space="preserve">u_ k/]jf ==========================agfP/ a:5 . </w:t>
+      </w:r>
+    </w:p>
+    <w:p>
+      <w:pPr>
+        <w:tabs>
+          <w:tab w:val="left" w:pos="1440"/>
+        </w:tabs>
+        <w:spacing w:after="0" w:line="360" w:lineRule="auto"/>
+        <w:jc w:val="both"/>
+        <w:rPr>
+          <w:rFonts w:ascii="Preeti" w:hAnsi="Preeti"/>
+          <w:sz w:val="34"/>
+          <w:szCs w:val="34"/>
+        </w:rPr>
+      </w:pPr>
+      <w:r>
+        <w:rPr>
+          <w:rFonts w:ascii="Preeti" w:hAnsi="Preeti"/>
+          <w:sz w:val="34"/>
+          <w:szCs w:val="34"/>
+        </w:rPr>
+        <w:t xml:space="preserve">3_ sfutL =========================x'G5 . </w:t>
+      </w:r>
+    </w:p>
+    <w:p>
+      <w:pPr>
+        <w:tabs>
+          <w:tab w:val="left" w:pos="1440"/>
+        </w:tabs>
+        <w:spacing w:after="0" w:line="360" w:lineRule="auto"/>
+        <w:jc w:val="both"/>
+        <w:rPr>
+          <w:rFonts w:ascii="Preeti" w:hAnsi="Preeti"/>
+          <w:sz w:val="34"/>
+          <w:szCs w:val="34"/>
+        </w:rPr>
+      </w:pPr>
+      <w:r>
+        <w:rPr>
+          <w:rFonts w:ascii="Preeti" w:hAnsi="Preeti"/>
+          <w:sz w:val="34"/>
+          <w:szCs w:val="34"/>
+        </w:rPr>
+        <w:t xml:space="preserve">ª_ kfgL kfgL x'g] Ct' ===================xf] . </w:t>
+      </w:r>
+    </w:p>
+    <w:p>
+      <w:pPr>
+        <w:tabs>
+          <w:tab w:val="left" w:pos="1440"/>
+        </w:tabs>
+        <w:spacing w:after="0" w:line="360" w:lineRule="auto"/>
+        <w:jc w:val="both"/>
+        <w:rPr>
+          <w:rFonts w:ascii="Preeti" w:hAnsi="Preeti"/>
+          <w:b/>
+          <w:bCs/>
+          <w:sz w:val="34"/>
+          <w:szCs w:val="34"/>
+        </w:rPr>
+      </w:pPr>
+      <w:r>
+        <w:rPr>
+          <w:rFonts w:ascii="Preeti" w:hAnsi="Preeti"/>
+          <w:b/>
+          <w:bCs/>
+          <w:sz w:val="34"/>
+          <w:szCs w:val="34"/>
+        </w:rPr>
+        <w:t>&amp;_ pN6f] cy{ lbg] zAb n]Vg'xf];\ .</w:t>
+      </w:r>
+      <w:r>
+        <w:rPr>
+          <w:rFonts w:ascii="Preeti" w:hAnsi="Preeti"/>
+          <w:b/>
+          <w:bCs/>
+          <w:sz w:val="34"/>
+          <w:szCs w:val="34"/>
+        </w:rPr>
+        <w:tab/>
+      </w:r>
+      <w:r>
+        <w:rPr>
+          <w:rFonts w:ascii="Preeti" w:hAnsi="Preeti"/>
+          <w:b/>
+          <w:bCs/>
+          <w:sz w:val="34"/>
+          <w:szCs w:val="34"/>
+        </w:rPr>
+        <w:tab/>
+      </w:r>
+      <w:r>
+        <w:rPr>
+          <w:rFonts w:ascii="Preeti" w:hAnsi="Preeti"/>
+          <w:b/>
+          <w:bCs/>
+          <w:sz w:val="34"/>
+          <w:szCs w:val="34"/>
+        </w:rPr>
+        <w:tab/>
+      </w:r>
+      <w:r>
+        <w:rPr>
+          <w:rFonts w:ascii="Preeti" w:hAnsi="Preeti"/>
+          <w:b/>
+          <w:bCs/>
+          <w:sz w:val="34"/>
+          <w:szCs w:val="34"/>
+        </w:rPr>
+        <w:tab/>
+      </w:r>
+      <w:r>
+        <w:rPr>
+          <w:rFonts w:ascii="Preeti" w:hAnsi="Preeti"/>
+          <w:b/>
+          <w:bCs/>
+          <w:sz w:val="34"/>
+          <w:szCs w:val="34"/>
+        </w:rPr>
+        <w:tab/>
+      </w:r>
+      <w:r>
+        <w:rPr>
+          <w:rFonts w:ascii="Preeti" w:hAnsi="Preeti"/>
+          <w:b/>
+          <w:bCs/>
+          <w:sz w:val="34"/>
+          <w:szCs w:val="34"/>
+        </w:rPr>
+        <w:tab/>
+      </w:r>
+      <w:r>
+        <w:rPr>
+          <w:rFonts w:ascii="Preeti" w:hAnsi="Preeti"/>
+          <w:b/>
+          <w:bCs/>
+          <w:sz w:val="34"/>
+          <w:szCs w:val="34"/>
+        </w:rPr>
+        <w:tab/>
+      </w:r>
+      <w:r>
+        <w:rPr>
+          <w:rFonts w:ascii="Preeti" w:hAnsi="Preeti"/>
+          <w:b/>
+          <w:bCs/>
+          <w:sz w:val="34"/>
+          <w:szCs w:val="34"/>
+        </w:rPr>
+        <w:tab/>
+      </w:r>
+      <w:r>
+        <w:rPr>
+          <w:rFonts w:ascii="Preeti" w:hAnsi="Preeti"/>
+          <w:b/>
+          <w:bCs/>
+          <w:sz w:val="34"/>
+          <w:szCs w:val="34"/>
+        </w:rPr>
+        <w:tab/>
+      </w:r>
+      <w:r>
+        <w:rPr>
+          <w:rFonts w:ascii="Preeti" w:hAnsi="Preeti"/>
+          <w:b/>
+          <w:bCs/>
+          <w:sz w:val="34"/>
+          <w:szCs w:val="34"/>
+        </w:rPr>
+        <w:tab/>
+      </w:r>
+      <w:r>
+        <w:rPr>
+          <w:rFonts w:ascii="Preeti" w:hAnsi="Preeti"/>
+          <w:b/>
+          <w:bCs/>
+          <w:sz w:val="34"/>
+          <w:szCs w:val="34"/>
+        </w:rPr>
+        <w:t>-#_</w:t>
+      </w:r>
+    </w:p>
+    <w:p>
+      <w:pPr>
+        <w:tabs>
+          <w:tab w:val="left" w:pos="1440"/>
+        </w:tabs>
+        <w:spacing w:after="0" w:line="360" w:lineRule="auto"/>
+        <w:jc w:val="both"/>
+        <w:rPr>
+          <w:rFonts w:ascii="Preeti" w:hAnsi="Preeti"/>
+          <w:sz w:val="34"/>
+          <w:szCs w:val="34"/>
+        </w:rPr>
+      </w:pPr>
+      <w:r>
+        <w:rPr>
+          <w:rFonts w:ascii="Preeti" w:hAnsi="Preeti"/>
+          <w:sz w:val="34"/>
+          <w:szCs w:val="34"/>
+        </w:rPr>
+        <w:t>gld7f] M =============================</w:t>
+      </w:r>
+    </w:p>
+    <w:p>
+      <w:pPr>
+        <w:tabs>
+          <w:tab w:val="left" w:pos="1440"/>
+        </w:tabs>
+        <w:spacing w:after="0" w:line="360" w:lineRule="auto"/>
+        <w:jc w:val="both"/>
+        <w:rPr>
+          <w:rFonts w:ascii="Preeti" w:hAnsi="Preeti"/>
+          <w:sz w:val="34"/>
+          <w:szCs w:val="34"/>
+        </w:rPr>
+      </w:pPr>
+      <w:r>
+        <w:rPr>
+          <w:rFonts w:ascii="Preeti" w:hAnsi="Preeti"/>
+          <w:sz w:val="34"/>
+          <w:szCs w:val="34"/>
+        </w:rPr>
+        <w:t>v';L M ==================================</w:t>
+      </w:r>
+    </w:p>
+    <w:p>
+      <w:pPr>
+        <w:tabs>
+          <w:tab w:val="left" w:pos="1440"/>
+        </w:tabs>
+        <w:spacing w:after="0" w:line="360" w:lineRule="auto"/>
+        <w:jc w:val="both"/>
+        <w:rPr>
+          <w:rFonts w:ascii="Preeti" w:hAnsi="Preeti"/>
+          <w:sz w:val="34"/>
+          <w:szCs w:val="34"/>
+        </w:rPr>
+      </w:pPr>
+      <w:r>
+        <w:rPr>
+          <w:rFonts w:ascii="Preeti" w:hAnsi="Preeti"/>
+          <w:sz w:val="34"/>
+          <w:szCs w:val="34"/>
+        </w:rPr>
+        <w:t>psfnL ==================================</w:t>
+      </w:r>
+    </w:p>
+    <w:p>
+      <w:pPr>
+        <w:tabs>
+          <w:tab w:val="left" w:pos="1440"/>
+        </w:tabs>
+        <w:spacing w:after="0" w:line="480" w:lineRule="auto"/>
+        <w:jc w:val="both"/>
+        <w:rPr>
+          <w:rFonts w:ascii="Preeti" w:hAnsi="Preeti"/>
+          <w:b/>
+          <w:bCs/>
+          <w:sz w:val="34"/>
+          <w:szCs w:val="34"/>
+        </w:rPr>
+      </w:pPr>
+      <w:r>
+        <w:rPr>
+          <w:rFonts w:ascii="Preeti" w:hAnsi="Preeti"/>
+          <w:b/>
+          <w:bCs/>
+          <w:sz w:val="34"/>
+          <w:szCs w:val="34"/>
+        </w:rPr>
+        <w:t>*_ jfSo agfpg'xf];\ .</w:t>
+      </w:r>
+      <w:r>
+        <w:rPr>
+          <w:rFonts w:ascii="Preeti" w:hAnsi="Preeti"/>
+          <w:b/>
+          <w:bCs/>
+          <w:sz w:val="34"/>
+          <w:szCs w:val="34"/>
+        </w:rPr>
+        <w:tab/>
       </w:r>
       <w:r>
         <w:rPr>
@@ -4713,181 +4160,296 @@
         <w:tabs>
           <w:tab w:val="left" w:pos="1440"/>
         </w:tabs>
-        <w:spacing w:after="0" w:line="360" w:lineRule="auto"/>
-        <w:jc w:val="both"/>
-        <w:rPr>
-          <w:rFonts w:ascii="Preeti" w:hAnsi="Preeti"/>
-          <w:sz w:val="34"/>
-          <w:szCs w:val="34"/>
-        </w:rPr>
-      </w:pPr>
-      <w:r>
-        <w:rPr>
-          <w:rFonts w:ascii="Preeti" w:hAnsi="Preeti"/>
-          <w:sz w:val="34"/>
-          <w:szCs w:val="34"/>
-        </w:rPr>
-        <w:t>gld7f] M =============================</w:t>
-      </w:r>
-    </w:p>
-    <w:p>
-      <w:pPr>
-        <w:tabs>
-          <w:tab w:val="left" w:pos="1440"/>
-        </w:tabs>
-        <w:spacing w:after="0" w:line="360" w:lineRule="auto"/>
-        <w:jc w:val="both"/>
-        <w:rPr>
-          <w:rFonts w:ascii="Preeti" w:hAnsi="Preeti"/>
-          <w:sz w:val="34"/>
-          <w:szCs w:val="34"/>
-        </w:rPr>
-      </w:pPr>
-      <w:r>
-        <w:rPr>
-          <w:rFonts w:ascii="Preeti" w:hAnsi="Preeti"/>
-          <w:sz w:val="34"/>
-          <w:szCs w:val="34"/>
-        </w:rPr>
-        <w:t>v</w:t>
-      </w:r>
-      <w:proofErr w:type="gramStart"/>
-      <w:r>
-        <w:rPr>
-          <w:rFonts w:ascii="Preeti" w:hAnsi="Preeti"/>
-          <w:sz w:val="34"/>
-          <w:szCs w:val="34"/>
-        </w:rPr>
-        <w:t>';L</w:t>
-      </w:r>
-      <w:proofErr w:type="gramEnd"/>
-      <w:r>
-        <w:rPr>
-          <w:rFonts w:ascii="Preeti" w:hAnsi="Preeti"/>
-          <w:sz w:val="34"/>
-          <w:szCs w:val="34"/>
-        </w:rPr>
-        <w:t xml:space="preserve"> M ==================================</w:t>
-      </w:r>
-    </w:p>
-    <w:p>
-      <w:pPr>
-        <w:tabs>
-          <w:tab w:val="left" w:pos="1440"/>
-        </w:tabs>
-        <w:spacing w:after="0" w:line="360" w:lineRule="auto"/>
-        <w:jc w:val="both"/>
-        <w:rPr>
-          <w:rFonts w:ascii="Preeti" w:hAnsi="Preeti"/>
-          <w:sz w:val="34"/>
-          <w:szCs w:val="34"/>
-        </w:rPr>
-      </w:pPr>
-      <w:r>
-        <w:rPr>
-          <w:rFonts w:ascii="Preeti" w:hAnsi="Preeti"/>
-          <w:sz w:val="34"/>
-          <w:szCs w:val="34"/>
-        </w:rPr>
-        <w:t>psfnL ==================================</w:t>
-      </w:r>
-    </w:p>
-    <w:p>
-      <w:pPr>
-        <w:tabs>
-          <w:tab w:val="left" w:pos="1440"/>
-        </w:tabs>
         <w:spacing w:after="0" w:line="480" w:lineRule="auto"/>
         <w:jc w:val="both"/>
         <w:rPr>
           <w:rFonts w:ascii="Preeti" w:hAnsi="Preeti"/>
-          <w:b/>
-          <w:bCs/>
-          <w:sz w:val="34"/>
-          <w:szCs w:val="34"/>
-        </w:rPr>
-      </w:pPr>
-      <w:r>
-        <w:rPr>
-          <w:rFonts w:ascii="Preeti" w:hAnsi="Preeti"/>
-          <w:b/>
-          <w:bCs/>
-          <w:sz w:val="34"/>
-          <w:szCs w:val="34"/>
-        </w:rPr>
-        <w:t>*_ jfSo agfpg'xf</w:t>
-      </w:r>
-      <w:proofErr w:type="gramStart"/>
-      <w:r>
-        <w:rPr>
-          <w:rFonts w:ascii="Preeti" w:hAnsi="Preeti"/>
-          <w:b/>
-          <w:bCs/>
-          <w:sz w:val="34"/>
-          <w:szCs w:val="34"/>
-        </w:rPr>
-        <w:t>];\</w:t>
-      </w:r>
-      <w:proofErr w:type="gramEnd"/>
-      <w:r>
-        <w:rPr>
-          <w:rFonts w:ascii="Preeti" w:hAnsi="Preeti"/>
-          <w:b/>
-          <w:bCs/>
-          <w:sz w:val="34"/>
-          <w:szCs w:val="34"/>
-        </w:rPr>
-        <w:t xml:space="preserve"> .</w:t>
-      </w:r>
-      <w:r>
-        <w:rPr>
-          <w:rFonts w:ascii="Preeti" w:hAnsi="Preeti"/>
-          <w:b/>
-          <w:bCs/>
-          <w:sz w:val="34"/>
-          <w:szCs w:val="34"/>
-        </w:rPr>
-        <w:tab/>
-      </w:r>
-      <w:r>
-        <w:rPr>
-          <w:rFonts w:ascii="Preeti" w:hAnsi="Preeti"/>
-          <w:b/>
-          <w:bCs/>
-          <w:sz w:val="34"/>
-          <w:szCs w:val="34"/>
-        </w:rPr>
-        <w:tab/>
-      </w:r>
-      <w:r>
-        <w:rPr>
-          <w:rFonts w:ascii="Preeti" w:hAnsi="Preeti"/>
-          <w:b/>
-          <w:bCs/>
-          <w:sz w:val="34"/>
-          <w:szCs w:val="34"/>
-        </w:rPr>
-        <w:tab/>
-      </w:r>
-      <w:r>
-        <w:rPr>
-          <w:rFonts w:ascii="Preeti" w:hAnsi="Preeti"/>
-          <w:b/>
-          <w:bCs/>
-          <w:sz w:val="34"/>
-          <w:szCs w:val="34"/>
-        </w:rPr>
-        <w:tab/>
-      </w:r>
-      <w:r>
-        <w:rPr>
-          <w:rFonts w:ascii="Preeti" w:hAnsi="Preeti"/>
-          <w:b/>
-          <w:bCs/>
-          <w:sz w:val="34"/>
-          <w:szCs w:val="34"/>
-        </w:rPr>
-        <w:tab/>
+          <w:sz w:val="34"/>
+          <w:szCs w:val="34"/>
+        </w:rPr>
+      </w:pPr>
+      <w:r>
+        <w:rPr>
+          <w:rFonts w:ascii="Preeti" w:hAnsi="Preeti"/>
+          <w:sz w:val="34"/>
+          <w:szCs w:val="34"/>
+        </w:rPr>
+        <w:t>3d08L M ===================================================================================================================</w:t>
+      </w:r>
+    </w:p>
+    <w:p>
+      <w:pPr>
+        <w:tabs>
+          <w:tab w:val="left" w:pos="1440"/>
+        </w:tabs>
+        <w:spacing w:after="0" w:line="480" w:lineRule="auto"/>
+        <w:jc w:val="both"/>
+        <w:rPr>
+          <w:rFonts w:ascii="Preeti" w:hAnsi="Preeti"/>
+          <w:sz w:val="34"/>
+          <w:szCs w:val="34"/>
+        </w:rPr>
+      </w:pPr>
+      <w:r>
+        <w:rPr>
+          <w:rFonts w:ascii="Preeti" w:hAnsi="Preeti"/>
+          <w:sz w:val="34"/>
+          <w:szCs w:val="34"/>
+        </w:rPr>
+        <w:t>;'Gb/ M ======================================================================================================================</w:t>
+      </w:r>
+    </w:p>
+    <w:p>
+      <w:pPr>
+        <w:tabs>
+          <w:tab w:val="left" w:pos="1440"/>
+        </w:tabs>
+        <w:spacing w:after="0" w:line="480" w:lineRule="auto"/>
+        <w:jc w:val="both"/>
+        <w:rPr>
+          <w:rFonts w:ascii="Preeti" w:hAnsi="Preeti"/>
+          <w:sz w:val="34"/>
+          <w:szCs w:val="34"/>
+        </w:rPr>
+      </w:pPr>
+      <w:r>
+        <w:rPr>
+          <w:rFonts w:ascii="Preeti" w:hAnsi="Preeti"/>
+          <w:sz w:val="34"/>
+          <w:szCs w:val="34"/>
+        </w:rPr>
+        <w:t>rf}tf/f] M ====================================================================================================================</w:t>
+      </w:r>
+    </w:p>
+    <w:p>
+      <w:pPr>
+        <w:tabs>
+          <w:tab w:val="left" w:pos="1440"/>
+        </w:tabs>
+        <w:spacing w:after="0" w:line="360" w:lineRule="auto"/>
+        <w:jc w:val="both"/>
+        <w:rPr>
+          <w:rFonts w:ascii="Preeti" w:hAnsi="Preeti"/>
+          <w:b/>
+          <w:bCs/>
+          <w:sz w:val="34"/>
+          <w:szCs w:val="34"/>
+        </w:rPr>
+      </w:pPr>
+      <w:r>
+        <w:rPr>
+          <w:rFonts w:ascii="Preeti" w:hAnsi="Preeti"/>
+          <w:b/>
+          <w:bCs/>
+          <w:sz w:val="34"/>
+          <w:szCs w:val="34"/>
+        </w:rPr>
+        <w:t>(_ s] elgG5 &lt; n]Vg'xf];\ .</w:t>
+      </w:r>
+      <w:r>
+        <w:rPr>
+          <w:rFonts w:ascii="Preeti" w:hAnsi="Preeti"/>
+          <w:b/>
+          <w:bCs/>
+          <w:sz w:val="34"/>
+          <w:szCs w:val="34"/>
+        </w:rPr>
+        <w:tab/>
+      </w:r>
+      <w:r>
+        <w:rPr>
+          <w:rFonts w:ascii="Preeti" w:hAnsi="Preeti"/>
+          <w:b/>
+          <w:bCs/>
+          <w:sz w:val="34"/>
+          <w:szCs w:val="34"/>
+        </w:rPr>
+        <w:tab/>
+      </w:r>
+      <w:r>
+        <w:rPr>
+          <w:rFonts w:ascii="Preeti" w:hAnsi="Preeti"/>
+          <w:b/>
+          <w:bCs/>
+          <w:sz w:val="34"/>
+          <w:szCs w:val="34"/>
+        </w:rPr>
+        <w:tab/>
+      </w:r>
+      <w:r>
+        <w:rPr>
+          <w:rFonts w:ascii="Preeti" w:hAnsi="Preeti"/>
+          <w:b/>
+          <w:bCs/>
+          <w:sz w:val="34"/>
+          <w:szCs w:val="34"/>
+        </w:rPr>
+        <w:tab/>
+      </w:r>
+      <w:r>
+        <w:rPr>
+          <w:rFonts w:ascii="Preeti" w:hAnsi="Preeti"/>
+          <w:b/>
+          <w:bCs/>
+          <w:sz w:val="34"/>
+          <w:szCs w:val="34"/>
+        </w:rPr>
+        <w:tab/>
+      </w:r>
+      <w:r>
+        <w:rPr>
+          <w:rFonts w:ascii="Preeti" w:hAnsi="Preeti"/>
+          <w:b/>
+          <w:bCs/>
+          <w:sz w:val="34"/>
+          <w:szCs w:val="34"/>
+        </w:rPr>
+        <w:tab/>
+      </w:r>
+      <w:r>
+        <w:rPr>
+          <w:rFonts w:ascii="Preeti" w:hAnsi="Preeti"/>
+          <w:b/>
+          <w:bCs/>
+          <w:sz w:val="34"/>
+          <w:szCs w:val="34"/>
+        </w:rPr>
+        <w:tab/>
+      </w:r>
+      <w:r>
+        <w:rPr>
+          <w:rFonts w:ascii="Preeti" w:hAnsi="Preeti"/>
+          <w:b/>
+          <w:bCs/>
+          <w:sz w:val="34"/>
+          <w:szCs w:val="34"/>
+        </w:rPr>
+        <w:tab/>
+      </w:r>
+      <w:r>
+        <w:rPr>
+          <w:rFonts w:ascii="Preeti" w:hAnsi="Preeti"/>
+          <w:b/>
+          <w:bCs/>
+          <w:sz w:val="34"/>
+          <w:szCs w:val="34"/>
+        </w:rPr>
+        <w:tab/>
+      </w:r>
+      <w:r>
+        <w:rPr>
+          <w:rFonts w:ascii="Preeti" w:hAnsi="Preeti"/>
+          <w:b/>
+          <w:bCs/>
+          <w:sz w:val="34"/>
+          <w:szCs w:val="34"/>
+        </w:rPr>
+        <w:tab/>
+      </w:r>
+      <w:r>
+        <w:rPr>
+          <w:rFonts w:ascii="Preeti" w:hAnsi="Preeti"/>
+          <w:b/>
+          <w:bCs/>
+          <w:sz w:val="34"/>
+          <w:szCs w:val="34"/>
+        </w:rPr>
+        <w:tab/>
+      </w:r>
+      <w:r>
+        <w:rPr>
+          <w:rFonts w:ascii="Preeti" w:hAnsi="Preeti"/>
+          <w:b/>
+          <w:bCs/>
+          <w:sz w:val="34"/>
+          <w:szCs w:val="34"/>
+        </w:rPr>
+        <w:t xml:space="preserve">-@_ </w:t>
+      </w:r>
+    </w:p>
+    <w:p>
+      <w:pPr>
+        <w:tabs>
+          <w:tab w:val="left" w:pos="1440"/>
+        </w:tabs>
+        <w:spacing w:after="0" w:line="360" w:lineRule="auto"/>
+        <w:jc w:val="both"/>
+        <w:rPr>
+          <w:rFonts w:ascii="Preeti" w:hAnsi="Preeti"/>
+          <w:sz w:val="34"/>
+          <w:szCs w:val="34"/>
+        </w:rPr>
+      </w:pPr>
+      <w:r>
+        <w:rPr>
+          <w:rFonts w:ascii="Preeti" w:hAnsi="Preeti"/>
+          <w:sz w:val="34"/>
+          <w:szCs w:val="34"/>
+        </w:rPr>
+        <w:t>s_ l;k ePsf] M ==========================================</w:t>
+      </w:r>
+    </w:p>
+    <w:p>
+      <w:pPr>
+        <w:tabs>
+          <w:tab w:val="left" w:pos="1440"/>
+        </w:tabs>
+        <w:spacing w:after="0" w:line="360" w:lineRule="auto"/>
+        <w:jc w:val="both"/>
+        <w:rPr>
+          <w:rFonts w:ascii="Preeti" w:hAnsi="Preeti"/>
+          <w:sz w:val="34"/>
+          <w:szCs w:val="34"/>
+        </w:rPr>
+      </w:pPr>
+      <w:r>
+        <w:rPr>
+          <w:rFonts w:ascii="Preeti" w:hAnsi="Preeti"/>
+          <w:sz w:val="34"/>
+          <w:szCs w:val="34"/>
+        </w:rPr>
+        <w:t>v_ an ePsf] M ==========================================</w:t>
+      </w:r>
+    </w:p>
+    <w:p>
+      <w:pPr>
+        <w:tabs>
+          <w:tab w:val="left" w:pos="1440"/>
+        </w:tabs>
+        <w:spacing w:after="0" w:line="360" w:lineRule="auto"/>
+        <w:jc w:val="both"/>
+        <w:rPr>
+          <w:rFonts w:ascii="Preeti" w:hAnsi="Preeti"/>
+          <w:sz w:val="34"/>
+          <w:szCs w:val="34"/>
+        </w:rPr>
+      </w:pPr>
+    </w:p>
+    <w:p>
+      <w:pPr>
+        <w:tabs>
+          <w:tab w:val="left" w:pos="1440"/>
+        </w:tabs>
+        <w:spacing w:after="0" w:line="360" w:lineRule="auto"/>
+        <w:jc w:val="both"/>
+        <w:rPr>
+          <w:rFonts w:ascii="Preeti" w:hAnsi="Preeti"/>
+          <w:b/>
+          <w:bCs/>
+          <w:sz w:val="34"/>
+          <w:szCs w:val="34"/>
+        </w:rPr>
+      </w:pPr>
+      <w:r>
+        <w:rPr>
+          <w:rFonts w:ascii="Preeti" w:hAnsi="Preeti"/>
+          <w:b/>
+          <w:bCs/>
+          <w:sz w:val="34"/>
+          <w:szCs w:val="34"/>
+        </w:rPr>
+        <w:lastRenderedPageBreak/>
+        <w:t>!)_ tn lbOPsf jfSonfO{ Ps jrgdf kl/jt{g ug'{xf];\ .</w:t>
       </w:r>
       <w:r>
         <w:rPr>
@@ -4965,542 +4527,21 @@
         <w:tabs>
           <w:tab w:val="left" w:pos="1440"/>
         </w:tabs>
-        <w:spacing w:after="0" w:line="480" w:lineRule="auto"/>
-        <w:jc w:val="both"/>
-        <w:rPr>
-          <w:rFonts w:ascii="Preeti" w:hAnsi="Preeti"/>
-          <w:sz w:val="34"/>
-          <w:szCs w:val="34"/>
-        </w:rPr>
-      </w:pPr>
-      <w:r>
-        <w:rPr>
-          <w:rFonts w:ascii="Preeti" w:hAnsi="Preeti"/>
-          <w:sz w:val="34"/>
-          <w:szCs w:val="34"/>
-        </w:rPr>
-        <w:t>3d08L M ===================================================================================================================</w:t>
-      </w:r>
-    </w:p>
-    <w:p>
-      <w:pPr>
-        <w:tabs>
-          <w:tab w:val="left" w:pos="1440"/>
-        </w:tabs>
-        <w:spacing w:after="0" w:line="480" w:lineRule="auto"/>
-        <w:jc w:val="both"/>
-        <w:rPr>
-          <w:rFonts w:ascii="Preeti" w:hAnsi="Preeti"/>
-          <w:sz w:val="34"/>
-          <w:szCs w:val="34"/>
-        </w:rPr>
-      </w:pPr>
-      <w:r>
-        <w:rPr>
-          <w:rFonts w:ascii="Preeti" w:hAnsi="Preeti"/>
-          <w:sz w:val="34"/>
-          <w:szCs w:val="34"/>
-        </w:rPr>
-        <w:t>;'Gb/ M ======================================================================================================================</w:t>
-      </w:r>
-    </w:p>
-    <w:p>
-      <w:pPr>
-        <w:tabs>
-          <w:tab w:val="left" w:pos="1440"/>
-        </w:tabs>
-        <w:spacing w:after="0" w:line="480" w:lineRule="auto"/>
-        <w:jc w:val="both"/>
-        <w:rPr>
-          <w:rFonts w:ascii="Preeti" w:hAnsi="Preeti"/>
-          <w:sz w:val="34"/>
-          <w:szCs w:val="34"/>
-        </w:rPr>
-      </w:pPr>
-      <w:r>
-        <w:rPr>
-          <w:rFonts w:ascii="Preeti" w:hAnsi="Preeti"/>
-          <w:sz w:val="34"/>
-          <w:szCs w:val="34"/>
-        </w:rPr>
-        <w:t>rf}tf/f] M ====================================================================================================================</w:t>
-      </w:r>
-    </w:p>
-    <w:p>
-      <w:pPr>
-        <w:tabs>
-          <w:tab w:val="left" w:pos="1440"/>
-        </w:tabs>
-        <w:spacing w:after="0" w:line="360" w:lineRule="auto"/>
-        <w:jc w:val="both"/>
-        <w:rPr>
-          <w:rFonts w:ascii="Preeti" w:hAnsi="Preeti"/>
-          <w:b/>
-          <w:bCs/>
-          <w:sz w:val="34"/>
-          <w:szCs w:val="34"/>
-        </w:rPr>
-      </w:pPr>
-      <w:r>
-        <w:rPr>
-          <w:rFonts w:ascii="Preeti" w:hAnsi="Preeti"/>
-          <w:b/>
-          <w:bCs/>
-          <w:sz w:val="34"/>
-          <w:szCs w:val="34"/>
-        </w:rPr>
-        <w:t xml:space="preserve">(_ s] elgG5 &lt; </w:t>
-      </w:r>
-      <w:proofErr w:type="gramStart"/>
-      <w:r>
-        <w:rPr>
-          <w:rFonts w:ascii="Preeti" w:hAnsi="Preeti"/>
-          <w:b/>
-          <w:bCs/>
-          <w:sz w:val="34"/>
-          <w:szCs w:val="34"/>
-        </w:rPr>
-        <w:t>n]Vg'xf];\</w:t>
-      </w:r>
-      <w:proofErr w:type="gramEnd"/>
-      <w:r>
-        <w:rPr>
-          <w:rFonts w:ascii="Preeti" w:hAnsi="Preeti"/>
-          <w:b/>
-          <w:bCs/>
-          <w:sz w:val="34"/>
-          <w:szCs w:val="34"/>
-        </w:rPr>
-        <w:t xml:space="preserve"> .</w:t>
-      </w:r>
-      <w:r>
-        <w:rPr>
-          <w:rFonts w:ascii="Preeti" w:hAnsi="Preeti"/>
-          <w:b/>
-          <w:bCs/>
-          <w:sz w:val="34"/>
-          <w:szCs w:val="34"/>
-        </w:rPr>
-        <w:tab/>
-      </w:r>
-      <w:r>
-        <w:rPr>
-          <w:rFonts w:ascii="Preeti" w:hAnsi="Preeti"/>
-          <w:b/>
-          <w:bCs/>
-          <w:sz w:val="34"/>
-          <w:szCs w:val="34"/>
-        </w:rPr>
-        <w:tab/>
-      </w:r>
-      <w:r>
-        <w:rPr>
-          <w:rFonts w:ascii="Preeti" w:hAnsi="Preeti"/>
-          <w:b/>
-          <w:bCs/>
-          <w:sz w:val="34"/>
-          <w:szCs w:val="34"/>
-        </w:rPr>
-        <w:tab/>
-      </w:r>
-      <w:r>
-        <w:rPr>
-          <w:rFonts w:ascii="Preeti" w:hAnsi="Preeti"/>
-          <w:b/>
-          <w:bCs/>
-          <w:sz w:val="34"/>
-          <w:szCs w:val="34"/>
-        </w:rPr>
-        <w:tab/>
-      </w:r>
-      <w:r>
-        <w:rPr>
-          <w:rFonts w:ascii="Preeti" w:hAnsi="Preeti"/>
-          <w:b/>
-          <w:bCs/>
-          <w:sz w:val="34"/>
-          <w:szCs w:val="34"/>
-        </w:rPr>
-        <w:tab/>
-      </w:r>
-      <w:r>
-        <w:rPr>
-          <w:rFonts w:ascii="Preeti" w:hAnsi="Preeti"/>
-          <w:b/>
-          <w:bCs/>
-          <w:sz w:val="34"/>
-          <w:szCs w:val="34"/>
-        </w:rPr>
-        <w:tab/>
-      </w:r>
-      <w:r>
-        <w:rPr>
-          <w:rFonts w:ascii="Preeti" w:hAnsi="Preeti"/>
-          <w:b/>
-          <w:bCs/>
-          <w:sz w:val="34"/>
-          <w:szCs w:val="34"/>
-        </w:rPr>
-        <w:tab/>
-      </w:r>
-      <w:r>
-        <w:rPr>
-          <w:rFonts w:ascii="Preeti" w:hAnsi="Preeti"/>
-          <w:b/>
-          <w:bCs/>
-          <w:sz w:val="34"/>
-          <w:szCs w:val="34"/>
-        </w:rPr>
-        <w:tab/>
-      </w:r>
-      <w:r>
-        <w:rPr>
-          <w:rFonts w:ascii="Preeti" w:hAnsi="Preeti"/>
-          <w:b/>
-          <w:bCs/>
-          <w:sz w:val="34"/>
-          <w:szCs w:val="34"/>
-        </w:rPr>
-        <w:tab/>
-      </w:r>
-      <w:r>
-        <w:rPr>
-          <w:rFonts w:ascii="Preeti" w:hAnsi="Preeti"/>
-          <w:b/>
-          <w:bCs/>
-          <w:sz w:val="34"/>
-          <w:szCs w:val="34"/>
-        </w:rPr>
-        <w:tab/>
-      </w:r>
-      <w:r>
-        <w:rPr>
-          <w:rFonts w:ascii="Preeti" w:hAnsi="Preeti"/>
-          <w:b/>
-          <w:bCs/>
-          <w:sz w:val="34"/>
-          <w:szCs w:val="34"/>
-        </w:rPr>
-        <w:tab/>
-      </w:r>
-      <w:r>
-        <w:rPr>
-          <w:rFonts w:ascii="Preeti" w:hAnsi="Preeti"/>
-          <w:b/>
-          <w:bCs/>
-          <w:sz w:val="34"/>
-          <w:szCs w:val="34"/>
-        </w:rPr>
-        <w:t xml:space="preserve">-@_ </w:t>
-      </w:r>
-    </w:p>
-    <w:p>
-      <w:pPr>
-        <w:tabs>
-          <w:tab w:val="left" w:pos="1440"/>
-        </w:tabs>
-        <w:spacing w:after="0" w:line="360" w:lineRule="auto"/>
-        <w:jc w:val="both"/>
-        <w:rPr>
-          <w:rFonts w:ascii="Preeti" w:hAnsi="Preeti"/>
-          <w:sz w:val="34"/>
-          <w:szCs w:val="34"/>
-        </w:rPr>
-      </w:pPr>
-      <w:r>
-        <w:rPr>
-          <w:rFonts w:ascii="Preeti" w:hAnsi="Preeti"/>
-          <w:sz w:val="34"/>
-          <w:szCs w:val="34"/>
-        </w:rPr>
-        <w:t xml:space="preserve">s_ </w:t>
-      </w:r>
-      <w:proofErr w:type="gramStart"/>
-      <w:r>
-        <w:rPr>
-          <w:rFonts w:ascii="Preeti" w:hAnsi="Preeti"/>
-          <w:sz w:val="34"/>
-          <w:szCs w:val="34"/>
-        </w:rPr>
-        <w:t>l;k</w:t>
-      </w:r>
-      <w:proofErr w:type="gramEnd"/>
-      <w:r>
-        <w:rPr>
-          <w:rFonts w:ascii="Preeti" w:hAnsi="Preeti"/>
-          <w:sz w:val="34"/>
-          <w:szCs w:val="34"/>
-        </w:rPr>
-        <w:t xml:space="preserve"> ePsf] M ==========================================</w:t>
-      </w:r>
-    </w:p>
-    <w:p>
-      <w:pPr>
-        <w:tabs>
-          <w:tab w:val="left" w:pos="1440"/>
-        </w:tabs>
-        <w:spacing w:after="0" w:line="360" w:lineRule="auto"/>
-        <w:jc w:val="both"/>
-        <w:rPr>
-          <w:rFonts w:ascii="Preeti" w:hAnsi="Preeti"/>
-          <w:sz w:val="34"/>
-          <w:szCs w:val="34"/>
-        </w:rPr>
-      </w:pPr>
-      <w:r>
-        <w:rPr>
-          <w:rFonts w:ascii="Preeti" w:hAnsi="Preeti"/>
-          <w:sz w:val="34"/>
-          <w:szCs w:val="34"/>
-        </w:rPr>
-        <w:t>v_ an ePsf] M ==========================================</w:t>
-      </w:r>
-    </w:p>
-    <w:p>
-      <w:pPr>
-        <w:tabs>
-          <w:tab w:val="left" w:pos="1440"/>
-        </w:tabs>
-        <w:spacing w:after="0" w:line="360" w:lineRule="auto"/>
-        <w:jc w:val="both"/>
-        <w:rPr>
-          <w:rFonts w:ascii="Preeti" w:hAnsi="Preeti"/>
-          <w:sz w:val="34"/>
-          <w:szCs w:val="34"/>
-        </w:rPr>
-      </w:pPr>
-    </w:p>
-    <w:p>
-      <w:pPr>
-        <w:tabs>
-          <w:tab w:val="left" w:pos="1440"/>
-        </w:tabs>
-        <w:spacing w:after="0" w:line="360" w:lineRule="auto"/>
-        <w:jc w:val="both"/>
-        <w:rPr>
-          <w:rFonts w:ascii="Preeti" w:hAnsi="Preeti"/>
-          <w:b/>
-          <w:bCs/>
-          <w:sz w:val="34"/>
-          <w:szCs w:val="34"/>
-        </w:rPr>
-      </w:pPr>
-      <w:proofErr w:type="gramStart"/>
-      <w:r>
-        <w:rPr>
-          <w:rFonts w:ascii="Preeti" w:hAnsi="Preeti"/>
-          <w:b/>
-          <w:bCs/>
-          <w:sz w:val="34"/>
-          <w:szCs w:val="34"/>
-        </w:rPr>
-        <w:lastRenderedPageBreak/>
-        <w:t>!)_</w:t>
-      </w:r>
-      <w:proofErr w:type="gramEnd"/>
-      <w:r>
-        <w:rPr>
-          <w:rFonts w:ascii="Preeti" w:hAnsi="Preeti"/>
-          <w:b/>
-          <w:bCs/>
-          <w:sz w:val="34"/>
-          <w:szCs w:val="34"/>
-        </w:rPr>
-        <w:t xml:space="preserve"> tn lbOPsf </w:t>
-      </w:r>
-      <w:proofErr w:type="gramStart"/>
-      <w:r>
-        <w:rPr>
-          <w:rFonts w:ascii="Preeti" w:hAnsi="Preeti"/>
-          <w:b/>
-          <w:bCs/>
-          <w:sz w:val="34"/>
-          <w:szCs w:val="34"/>
-        </w:rPr>
-        <w:t>jfSonfO{ Ps</w:t>
-      </w:r>
-      <w:proofErr w:type="gramEnd"/>
-      <w:r>
-        <w:rPr>
-          <w:rFonts w:ascii="Preeti" w:hAnsi="Preeti"/>
-          <w:b/>
-          <w:bCs/>
-          <w:sz w:val="34"/>
-          <w:szCs w:val="34"/>
-        </w:rPr>
-        <w:t xml:space="preserve"> jrgdf kl/</w:t>
-      </w:r>
-      <w:proofErr w:type="gramStart"/>
-      <w:r>
-        <w:rPr>
-          <w:rFonts w:ascii="Preeti" w:hAnsi="Preeti"/>
-          <w:b/>
-          <w:bCs/>
-          <w:sz w:val="34"/>
-          <w:szCs w:val="34"/>
-        </w:rPr>
-        <w:t>jt{</w:t>
-      </w:r>
-      <w:proofErr w:type="gramEnd"/>
-      <w:r>
-        <w:rPr>
-          <w:rFonts w:ascii="Preeti" w:hAnsi="Preeti"/>
-          <w:b/>
-          <w:bCs/>
-          <w:sz w:val="34"/>
-          <w:szCs w:val="34"/>
-        </w:rPr>
-        <w:t>g ug'{xf</w:t>
-      </w:r>
-      <w:proofErr w:type="gramStart"/>
-      <w:r>
-        <w:rPr>
-          <w:rFonts w:ascii="Preeti" w:hAnsi="Preeti"/>
-          <w:b/>
-          <w:bCs/>
-          <w:sz w:val="34"/>
-          <w:szCs w:val="34"/>
-        </w:rPr>
-        <w:t>];\</w:t>
-      </w:r>
-      <w:proofErr w:type="gramEnd"/>
-      <w:r>
-        <w:rPr>
-          <w:rFonts w:ascii="Preeti" w:hAnsi="Preeti"/>
-          <w:b/>
-          <w:bCs/>
-          <w:sz w:val="34"/>
-          <w:szCs w:val="34"/>
-        </w:rPr>
-        <w:t xml:space="preserve"> .</w:t>
-      </w:r>
-      <w:r>
-        <w:rPr>
-          <w:rFonts w:ascii="Preeti" w:hAnsi="Preeti"/>
-          <w:b/>
-          <w:bCs/>
-          <w:sz w:val="34"/>
-          <w:szCs w:val="34"/>
-        </w:rPr>
-        <w:tab/>
-      </w:r>
-      <w:r>
-        <w:rPr>
-          <w:rFonts w:ascii="Preeti" w:hAnsi="Preeti"/>
-          <w:b/>
-          <w:bCs/>
-          <w:sz w:val="34"/>
-          <w:szCs w:val="34"/>
-        </w:rPr>
-        <w:tab/>
-      </w:r>
-      <w:r>
-        <w:rPr>
-          <w:rFonts w:ascii="Preeti" w:hAnsi="Preeti"/>
-          <w:b/>
-          <w:bCs/>
-          <w:sz w:val="34"/>
-          <w:szCs w:val="34"/>
-        </w:rPr>
-        <w:tab/>
-      </w:r>
-      <w:r>
-        <w:rPr>
-          <w:rFonts w:ascii="Preeti" w:hAnsi="Preeti"/>
-          <w:b/>
-          <w:bCs/>
-          <w:sz w:val="34"/>
-          <w:szCs w:val="34"/>
-        </w:rPr>
-        <w:tab/>
-      </w:r>
-      <w:r>
-        <w:rPr>
-          <w:rFonts w:ascii="Preeti" w:hAnsi="Preeti"/>
-          <w:b/>
-          <w:bCs/>
-          <w:sz w:val="34"/>
-          <w:szCs w:val="34"/>
-        </w:rPr>
-        <w:tab/>
-      </w:r>
-      <w:r>
-        <w:rPr>
-          <w:rFonts w:ascii="Preeti" w:hAnsi="Preeti"/>
-          <w:b/>
-          <w:bCs/>
-          <w:sz w:val="34"/>
-          <w:szCs w:val="34"/>
-        </w:rPr>
-        <w:tab/>
-      </w:r>
-      <w:r>
-        <w:rPr>
-          <w:rFonts w:ascii="Preeti" w:hAnsi="Preeti"/>
-          <w:b/>
-          <w:bCs/>
-          <w:sz w:val="34"/>
-          <w:szCs w:val="34"/>
-        </w:rPr>
-        <w:t xml:space="preserve">-#_ </w:t>
-      </w:r>
-    </w:p>
-    <w:p>
-      <w:pPr>
-        <w:tabs>
-          <w:tab w:val="left" w:pos="1440"/>
-        </w:tabs>
-        <w:spacing w:after="0" w:line="360" w:lineRule="auto"/>
-        <w:jc w:val="both"/>
-        <w:rPr>
-          <w:rFonts w:ascii="Preeti" w:hAnsi="Preeti"/>
-          <w:sz w:val="34"/>
-          <w:szCs w:val="34"/>
-        </w:rPr>
-      </w:pPr>
-      <w:r>
-        <w:rPr>
-          <w:rFonts w:ascii="Preeti" w:hAnsi="Preeti"/>
-          <w:sz w:val="34"/>
-          <w:szCs w:val="34"/>
-        </w:rPr>
-        <w:t xml:space="preserve">s_ xfdL </w:t>
-      </w:r>
-      <w:proofErr w:type="gramStart"/>
-      <w:r>
-        <w:rPr>
-          <w:rFonts w:ascii="Preeti" w:hAnsi="Preeti"/>
-          <w:sz w:val="34"/>
-          <w:szCs w:val="34"/>
-        </w:rPr>
-        <w:t>v]Ng</w:t>
-      </w:r>
-      <w:proofErr w:type="gramEnd"/>
-      <w:r>
-        <w:rPr>
-          <w:rFonts w:ascii="Preeti" w:hAnsi="Preeti"/>
-          <w:sz w:val="34"/>
-          <w:szCs w:val="34"/>
-        </w:rPr>
-        <w:t xml:space="preserve"> hfG5</w:t>
-      </w:r>
-      <w:proofErr w:type="gramStart"/>
-      <w:r>
-        <w:rPr>
-          <w:rFonts w:ascii="Preeti" w:hAnsi="Preeti"/>
-          <w:sz w:val="34"/>
-          <w:szCs w:val="34"/>
-        </w:rPr>
-        <w:t>f}+</w:t>
-      </w:r>
-      <w:proofErr w:type="gramEnd"/>
-      <w:r>
-        <w:rPr>
-          <w:rFonts w:ascii="Preeti" w:hAnsi="Preeti"/>
-          <w:sz w:val="34"/>
-          <w:szCs w:val="34"/>
-        </w:rPr>
-        <w:t xml:space="preserve"> . </w:t>
+        <w:spacing w:after="0" w:line="360" w:lineRule="auto"/>
+        <w:jc w:val="both"/>
+        <w:rPr>
+          <w:rFonts w:ascii="Preeti" w:hAnsi="Preeti"/>
+          <w:sz w:val="34"/>
+          <w:szCs w:val="34"/>
+        </w:rPr>
+      </w:pPr>
+      <w:r>
+        <w:rPr>
+          <w:rFonts w:ascii="Preeti" w:hAnsi="Preeti"/>
+          <w:sz w:val="34"/>
+          <w:szCs w:val="34"/>
+        </w:rPr>
+        <w:t xml:space="preserve">s_ xfdL v]Ng hfG5f}+ . </w:t>
       </w:r>
     </w:p>
     <w:p>
@@ -5552,43 +4593,7 @@
           <w:sz w:val="34"/>
           <w:szCs w:val="34"/>
         </w:rPr>
-        <w:t xml:space="preserve">v_ xfdL </w:t>
-      </w:r>
-      <w:proofErr w:type="gramStart"/>
-      <w:r>
-        <w:rPr>
-          <w:rFonts w:ascii="Preeti" w:hAnsi="Preeti"/>
-          <w:sz w:val="34"/>
-          <w:szCs w:val="34"/>
-        </w:rPr>
-        <w:t>u[xsfo{ u</w:t>
-      </w:r>
-      <w:proofErr w:type="gramEnd"/>
-      <w:r>
-        <w:rPr>
-          <w:rFonts w:ascii="Preeti" w:hAnsi="Preeti"/>
-          <w:sz w:val="34"/>
-          <w:szCs w:val="34"/>
-        </w:rPr>
-        <w:t>5</w:t>
-      </w:r>
-      <w:proofErr w:type="gramStart"/>
-      <w:r>
-        <w:rPr>
-          <w:rFonts w:ascii="Preeti" w:hAnsi="Preeti"/>
-          <w:sz w:val="34"/>
-          <w:szCs w:val="34"/>
-        </w:rPr>
-        <w:t>f}{</w:t>
-      </w:r>
-      <w:proofErr w:type="gramEnd"/>
-      <w:r>
-        <w:rPr>
-          <w:rFonts w:ascii="Preeti" w:hAnsi="Preeti"/>
-          <w:sz w:val="34"/>
-          <w:szCs w:val="34"/>
-        </w:rPr>
-        <w:t xml:space="preserve"> . </w:t>
+        <w:t xml:space="preserve">v_ xfdL u[xsfo{ u5f}{ . </w:t>
       </w:r>
     </w:p>
     <w:p>
@@ -5640,25 +4645,7 @@
           <w:sz w:val="34"/>
           <w:szCs w:val="34"/>
         </w:rPr>
-        <w:t>u_ xfdL 3/ kms{G5</w:t>
-      </w:r>
-      <w:proofErr w:type="gramStart"/>
-      <w:r>
-        <w:rPr>
-          <w:rFonts w:ascii="Preeti" w:hAnsi="Preeti"/>
-          <w:sz w:val="34"/>
-          <w:szCs w:val="34"/>
-        </w:rPr>
-        <w:t>f}+</w:t>
-      </w:r>
-      <w:proofErr w:type="gramEnd"/>
-      <w:r>
-        <w:rPr>
-          <w:rFonts w:ascii="Preeti" w:hAnsi="Preeti"/>
-          <w:sz w:val="34"/>
-          <w:szCs w:val="34"/>
-        </w:rPr>
-        <w:t xml:space="preserve"> . </w:t>
+        <w:t xml:space="preserve">u_ xfdL 3/ kms{G5f}+ . </w:t>
       </w:r>
     </w:p>
     <w:p>
@@ -5714,51 +4701,7 @@
           <w:sz w:val="34"/>
           <w:szCs w:val="34"/>
         </w:rPr>
-        <w:t>!!_ tnsf k|</w:t>
-      </w:r>
-      <w:proofErr w:type="gramStart"/>
-      <w:r>
-        <w:rPr>
-          <w:rFonts w:ascii="Preeti" w:hAnsi="Preeti"/>
-          <w:b/>
-          <w:bCs/>
-          <w:sz w:val="34"/>
-          <w:szCs w:val="34"/>
-        </w:rPr>
-        <w:t>Zgx?sf</w:t>
-      </w:r>
-      <w:proofErr w:type="gramEnd"/>
-      <w:r>
-        <w:rPr>
-          <w:rFonts w:ascii="Preeti" w:hAnsi="Preeti"/>
-          <w:b/>
-          <w:bCs/>
-          <w:sz w:val="34"/>
-          <w:szCs w:val="34"/>
-        </w:rPr>
-        <w:t xml:space="preserve">] pQ/ </w:t>
-      </w:r>
-      <w:proofErr w:type="gramStart"/>
-      <w:r>
-        <w:rPr>
-          <w:rFonts w:ascii="Preeti" w:hAnsi="Preeti"/>
-          <w:b/>
-          <w:bCs/>
-          <w:sz w:val="34"/>
-          <w:szCs w:val="34"/>
-        </w:rPr>
-        <w:t>n]Vg'xf];\</w:t>
-      </w:r>
-      <w:proofErr w:type="gramEnd"/>
-      <w:r>
-        <w:rPr>
-          <w:rFonts w:ascii="Preeti" w:hAnsi="Preeti"/>
-          <w:b/>
-          <w:bCs/>
-          <w:sz w:val="34"/>
-          <w:szCs w:val="34"/>
-        </w:rPr>
-        <w:t xml:space="preserve"> .</w:t>
+        <w:t>!!_ tnsf k|Zgx?sf] pQ/ n]Vg'xf];\ .</w:t>
       </w:r>
       <w:r>
         <w:rPr>
@@ -5932,61 +4875,7 @@
           <w:sz w:val="34"/>
           <w:szCs w:val="34"/>
         </w:rPr>
-        <w:t xml:space="preserve">v_ </w:t>
-      </w:r>
-      <w:proofErr w:type="gramStart"/>
-      <w:r>
-        <w:rPr>
-          <w:rFonts w:ascii="Preeti" w:hAnsi="Preeti"/>
-          <w:sz w:val="34"/>
-          <w:szCs w:val="34"/>
-        </w:rPr>
-        <w:t>dg]nfO{ klxnf</w:t>
-      </w:r>
-      <w:proofErr w:type="gramEnd"/>
-      <w:r>
-        <w:rPr>
-          <w:rFonts w:ascii="Preeti" w:hAnsi="Preeti"/>
-          <w:sz w:val="34"/>
-          <w:szCs w:val="34"/>
-        </w:rPr>
-        <w:t xml:space="preserve"> </w:t>
-      </w:r>
-      <w:proofErr w:type="gramStart"/>
-      <w:r>
-        <w:rPr>
-          <w:rFonts w:ascii="Preeti" w:hAnsi="Preeti"/>
-          <w:sz w:val="34"/>
-          <w:szCs w:val="34"/>
-        </w:rPr>
-        <w:t>s;n</w:t>
-      </w:r>
-      <w:proofErr w:type="gramEnd"/>
-      <w:r>
-        <w:rPr>
-          <w:rFonts w:ascii="Preeti" w:hAnsi="Preeti"/>
-          <w:sz w:val="34"/>
-          <w:szCs w:val="34"/>
-        </w:rPr>
-        <w:t xml:space="preserve">] </w:t>
-      </w:r>
-      <w:proofErr w:type="gramStart"/>
-      <w:r>
-        <w:rPr>
-          <w:rFonts w:ascii="Preeti" w:hAnsi="Preeti"/>
-          <w:sz w:val="34"/>
-          <w:szCs w:val="34"/>
-        </w:rPr>
-        <w:t>e]§</w:t>
-      </w:r>
-      <w:proofErr w:type="gramEnd"/>
-      <w:r>
-        <w:rPr>
-          <w:rFonts w:ascii="Preeti" w:hAnsi="Preeti"/>
-          <w:sz w:val="34"/>
-          <w:szCs w:val="34"/>
-        </w:rPr>
-        <w:t xml:space="preserve">fof] &lt; </w:t>
+        <w:t xml:space="preserve">v_ dg]nfO{ klxnf s;n] e]§fof] &lt; </w:t>
       </w:r>
     </w:p>
     <w:p>
@@ -6142,43 +5031,7 @@
           <w:sz w:val="34"/>
           <w:szCs w:val="34"/>
         </w:rPr>
-        <w:t>ª</w:t>
-      </w:r>
-      <w:proofErr w:type="gramStart"/>
-      <w:r>
-        <w:rPr>
-          <w:rFonts w:ascii="Preeti" w:hAnsi="Preeti"/>
-          <w:sz w:val="34"/>
-          <w:szCs w:val="34"/>
-        </w:rPr>
-        <w:t>_ ;</w:t>
-      </w:r>
-      <w:proofErr w:type="gramEnd"/>
-      <w:r>
-        <w:rPr>
-          <w:rFonts w:ascii="Preeti" w:hAnsi="Preeti"/>
-          <w:sz w:val="34"/>
-          <w:szCs w:val="34"/>
-        </w:rPr>
-        <w:t>'zfGt l6=eL= df s] x]</w:t>
-      </w:r>
-      <w:proofErr w:type="gramStart"/>
-      <w:r>
-        <w:rPr>
-          <w:rFonts w:ascii="Preeti" w:hAnsi="Preeti"/>
-          <w:sz w:val="34"/>
-          <w:szCs w:val="34"/>
-        </w:rPr>
-        <w:t>5{ &lt;</w:t>
-      </w:r>
-      <w:proofErr w:type="gramEnd"/>
-      <w:r>
-        <w:rPr>
-          <w:rFonts w:ascii="Preeti" w:hAnsi="Preeti"/>
-          <w:sz w:val="34"/>
-          <w:szCs w:val="34"/>
-        </w:rPr>
-        <w:t xml:space="preserve"> </w:t>
+        <w:t xml:space="preserve">ª_ ;'zfGt l6=eL= df s] x]5{ &lt; </w:t>
       </w:r>
     </w:p>
     <w:p>
@@ -6226,115 +5079,15 @@
           <w:szCs w:val="34"/>
         </w:rPr>
       </w:pPr>
-      <w:proofErr w:type="gramStart"/>
-      <w:r>
-        <w:rPr>
-          <w:rFonts w:ascii="Preeti" w:hAnsi="Preeti"/>
-          <w:b/>
-          <w:bCs/>
-          <w:sz w:val="34"/>
-          <w:szCs w:val="34"/>
-        </w:rPr>
-        <w:t>!@</w:t>
-      </w:r>
-      <w:proofErr w:type="gramEnd"/>
-      <w:r>
-        <w:rPr>
-          <w:rFonts w:ascii="Preeti" w:hAnsi="Preeti"/>
-          <w:b/>
-          <w:bCs/>
-          <w:sz w:val="34"/>
-          <w:szCs w:val="34"/>
-        </w:rPr>
-        <w:t>_ cfkm\gf] af/]</w:t>
-      </w:r>
-      <w:proofErr w:type="gramStart"/>
-      <w:r>
-        <w:rPr>
-          <w:rFonts w:ascii="Preeti" w:hAnsi="Preeti"/>
-          <w:b/>
-          <w:bCs/>
-          <w:sz w:val="34"/>
-          <w:szCs w:val="34"/>
-        </w:rPr>
-        <w:t>df !</w:t>
-      </w:r>
-      <w:proofErr w:type="gramEnd"/>
-      <w:r>
-        <w:rPr>
-          <w:rFonts w:ascii="Preeti" w:hAnsi="Preeti"/>
-          <w:b/>
-          <w:bCs/>
-          <w:sz w:val="34"/>
-          <w:szCs w:val="34"/>
-        </w:rPr>
-        <w:t>)) zAb g36</w:t>
-      </w:r>
-      <w:proofErr w:type="gramStart"/>
-      <w:r>
-        <w:rPr>
-          <w:rFonts w:ascii="Preeti" w:hAnsi="Preeti"/>
-          <w:b/>
-          <w:bCs/>
-          <w:sz w:val="34"/>
-          <w:szCs w:val="34"/>
-        </w:rPr>
-        <w:t>fO{ Ps</w:t>
-      </w:r>
-      <w:proofErr w:type="gramEnd"/>
-      <w:r>
-        <w:rPr>
-          <w:rFonts w:ascii="Preeti" w:hAnsi="Preeti"/>
-          <w:b/>
-          <w:bCs/>
-          <w:sz w:val="34"/>
-          <w:szCs w:val="34"/>
-        </w:rPr>
-        <w:t xml:space="preserve"> cg'R</w:t>
-      </w:r>
-      <w:proofErr w:type="gramStart"/>
-      <w:r>
-        <w:rPr>
-          <w:rFonts w:ascii="Preeti" w:hAnsi="Preeti"/>
-          <w:b/>
-          <w:bCs/>
-          <w:sz w:val="34"/>
-          <w:szCs w:val="34"/>
-        </w:rPr>
-        <w:t>5]b</w:t>
-      </w:r>
-      <w:proofErr w:type="gramEnd"/>
-      <w:r>
-        <w:rPr>
-          <w:rFonts w:ascii="Preeti" w:hAnsi="Preeti"/>
-          <w:b/>
-          <w:bCs/>
-          <w:sz w:val="34"/>
-          <w:szCs w:val="34"/>
-        </w:rPr>
-        <w:t xml:space="preserve"> </w:t>
-      </w:r>
-      <w:proofErr w:type="gramStart"/>
-      <w:r>
-        <w:rPr>
-          <w:rFonts w:ascii="Preeti" w:hAnsi="Preeti"/>
-          <w:b/>
-          <w:bCs/>
-          <w:sz w:val="34"/>
-          <w:szCs w:val="34"/>
-        </w:rPr>
-        <w:t>n]Vg'xf];\</w:t>
-      </w:r>
-      <w:proofErr w:type="gramEnd"/>
-      <w:r>
-        <w:rPr>
-          <w:rFonts w:ascii="Preeti" w:hAnsi="Preeti"/>
-          <w:b/>
-          <w:bCs/>
-          <w:sz w:val="34"/>
-          <w:szCs w:val="34"/>
-        </w:rPr>
-        <w:t xml:space="preserve"> .</w:t>
+      <w:r>
+        <w:rPr>
+          <w:rFonts w:ascii="Preeti" w:hAnsi="Preeti"/>
+          <w:b/>
+          <w:bCs/>
+          <w:sz w:val="34"/>
+          <w:szCs w:val="34"/>
+        </w:rPr>
+        <w:t>!@_ cfkm\gf] af/]df !)) zAb g36fO{ Ps cg'R5]b n]Vg'xf];\ .</w:t>
       </w:r>
       <w:r>
         <w:rPr>
@@ -6598,7 +5351,6 @@
           <w:szCs w:val="34"/>
         </w:rPr>
       </w:pPr>
-      <w:proofErr w:type="gramStart"/>
       <w:r>
         <w:rPr>
           <w:rFonts w:ascii="Preeti" w:hAnsi="Preeti"/>
@@ -6608,17 +5360,6 @@
           <w:szCs w:val="34"/>
         </w:rPr>
         <w:t>;dfKt</w:t>
-      </w:r>
-      <w:proofErr w:type="gramEnd"/>
-      <w:r>
-        <w:rPr>
-          <w:rFonts w:ascii="Preeti" w:hAnsi="Preeti"/>
-          <w:b/>
-          <w:bCs/>
-          <w:sz w:val="34"/>
-          <w:szCs w:val="34"/>
-        </w:rPr>
-        <w:t xml:space="preserve"> </w:t>
       </w:r>
     </w:p>
     <w:p/>

</xml_diff>